<commit_message>
docs(report): add required task stages, grouped feature importance and unsupervised ablation
</commit_message>
<xml_diff>
--- a/report/IT7009_Group_Project_Report.docx
+++ b/report/IT7009_Group_Project_Report.docx
@@ -2467,7 +2467,21 @@
           <w:i w:val="0"/>
           <w:sz w:val="22"/>
         </w:rPr>
-        <w:t>The remainder of this report follows that structure. Section 2 covers data preparation, Section 3 the exploratory analysis and visualisation, Section 4 feature development and selection, Section 5 the supervised models, Section 6 the unsupervised analysis, Section 7 the critical evaluation, and Section 8 the conclusion. All figures and tables are referenced in the text, and every quantitative result quoted below was produced by the accompanying notebook.</w:t>
+        <w:t>The remainder of this report follows the structure required by the brief. Section 2 covers data preparation; Section 3 covers data exploration and visualisation; Section 4 covers feature development, analysis and selection; Section 5 covers the supervised learning task; Section 6 covers the unsupervised learning task; Section 7 covers critical evaluation and reflection; and Section 8 is the conclusion, followed by the references. The cover page, table of contents, list of figures and list of tables precede the Introduction.</w:t>
+      </w:r>
+    </w:p>
+    <w:p>
+      <w:pPr>
+        <w:spacing w:lineRule="auto" w:line="360" w:after="120"/>
+      </w:pPr>
+      <w:r>
+        <w:rPr>
+          <w:rFonts w:ascii="Times New Roman" w:hAnsi="Times New Roman" w:cs="Times New Roman" w:eastAsia="Times New Roman"/>
+          <w:b w:val="0"/>
+          <w:i w:val="0"/>
+          <w:sz w:val="22"/>
+        </w:rPr>
+        <w:t>The brief requires each learning task to address Data Preparation, Feature Development, Model Design, and Evaluation and Validation. Within the supervised task these are Sections 5.1, 5.2, 5.3 and 5.4 respectively, with the detailed results in Sections 5.5–5.10. Within the unsupervised task they are Sections 6.1, 6.2, 6.3 and 6.4, with the detailed results in Sections 6.5–6.9. Every figure and table is referenced in the text, and every quantitative result quoted in this report was produced by the accompanying notebook.</w:t>
       </w:r>
     </w:p>
     <w:p>
@@ -5394,7 +5408,7 @@
           <w:i w:val="0"/>
           <w:sz w:val="22"/>
         </w:rPr>
-        <w:t>Class imbalance — handled through stratified splitting and class_weight='balanced', with random over-sampling tested as an alternative in Section 5.4.</w:t>
+        <w:t>Class imbalance — handled through stratified splitting and class_weight='balanced', with random over-sampling tested as an alternative in Section 5.7.</w:t>
       </w:r>
     </w:p>
     <w:p>
@@ -7405,7 +7419,7 @@
                 <w:i w:val="0"/>
                 <w:sz w:val="17"/>
               </w:rPr>
-              <w:t>A near-perfect proxy for the target. Keeping it raises measured macro-F1 from 0.721 to 0.984 — an artificial result that could never be reproduced in service.</w:t>
+              <w:t>A near-perfect proxy for the target. Keeping it raises measured macro-F1 from 0.701 to 0.984 — an artificial result that could never be reproduced in service.</w:t>
             </w:r>
           </w:p>
         </w:tc>
@@ -8001,7 +8015,7 @@
           <w:i w:val="0"/>
           <w:sz w:val="22"/>
         </w:rPr>
-        <w:t>The ablation study in Section 4.4 quantifies the consequence of this decision directly: including the two leaking variables inflates macro-F1 to approximately 0.984, whereas the honest model reaches approximately 0.721. Reporting the former would have been misleading.</w:t>
+        <w:t>The ablation study in Section 4.4 quantifies the consequence of this decision directly: including the two leaking variables inflates macro-F1 to approximately 0.984, whereas the honest model reaches approximately 0.701. Reporting the former would have been misleading.</w:t>
       </w:r>
     </w:p>
     <w:p>
@@ -8165,7 +8179,7 @@
       <w:r>
         <w:drawing>
           <wp:inline xmlns:a="http://schemas.openxmlformats.org/drawingml/2006/main" xmlns:pic="http://schemas.openxmlformats.org/drawingml/2006/picture">
-            <wp:extent cx="5852160" cy="2023644"/>
+            <wp:extent cx="5852160" cy="3641664"/>
             <wp:docPr id="9" name="Picture 9"/>
             <wp:cNvGraphicFramePr>
               <a:graphicFrameLocks noChangeAspect="1"/>
@@ -8186,7 +8200,7 @@
                   <pic:spPr>
                     <a:xfrm>
                       <a:off x="0" y="0"/>
-                      <a:ext cx="5852160" cy="2023644"/>
+                      <a:ext cx="5852160" cy="3641664"/>
                     </a:xfrm>
                     <a:prstGeom prst="rect"/>
                   </pic:spPr>
@@ -8233,7 +8247,7 @@
           <w:i w:val="0"/>
           <w:sz w:val="20"/>
         </w:rPr>
-        <w:t>. Feature-importance rankings from three independent methods: (a) mutual information, (b) random-forest Gini importance and (c) permutation importance measured by the decrease in macro-F1. Traffic_Density, Accident_History and Vehicle_Count rank highly in all three.</w:t>
+        <w:t>. Feature-importance rankings: (a) mutual information, (b) random-forest Gini importance, (c) permutation importance measured by the decrease in macro-F1, and (d) permutation importance aggregated by attribute category. Traffic_Density, Accident_History and Vehicle_Count rank highly in all three per-feature methods.</w:t>
       </w:r>
     </w:p>
     <w:p>
@@ -8874,23 +8888,6 @@
     </w:p>
     <w:p>
       <w:pPr>
-        <w:pStyle w:val="Heading2"/>
-        <w:keepNext/>
-        <w:spacing w:before="200" w:after="120" w:lineRule="auto" w:line="360"/>
-      </w:pPr>
-      <w:r>
-        <w:rPr>
-          <w:rFonts w:ascii="Times New Roman" w:hAnsi="Times New Roman" w:cs="Times New Roman" w:eastAsia="Times New Roman"/>
-          <w:b/>
-          <w:i w:val="0"/>
-          <w:color w:val="000000"/>
-          <w:sz w:val="24"/>
-        </w:rPr>
-        <w:t>4.5 Feature-subset ablation study</w:t>
-      </w:r>
-    </w:p>
-    <w:p>
-      <w:pPr>
         <w:spacing w:lineRule="auto" w:line="360" w:after="120"/>
       </w:pPr>
       <w:r>
@@ -8900,7 +8897,7 @@
           <w:i w:val="0"/>
           <w:sz w:val="22"/>
         </w:rPr>
-        <w:t>The brief requires the impact of different feature subsets on the models to be assessed. A fixed random forest was therefore trained four times with identical settings, changing only the input features. Table 9 and Figure 10 present the results.</w:t>
+        <w:t>The brief asks specifically for the influence of environmental, temporal, spatial and road-related variables to be evaluated. Because per-feature rankings are hard to read at that level of abstraction, the permutation importance is also aggregated by attribute category. Table 9 reports the result and Figure 9(d) shows it graphically.</w:t>
       </w:r>
     </w:p>
     <w:p>
@@ -8939,7 +8936,7 @@
           <w:i w:val="0"/>
           <w:sz w:val="20"/>
         </w:rPr>
-        <w:t>. Feature-subset ablation study (fixed random forest, identical settings)</w:t>
+        <w:t>. Permutation importance aggregated by attribute category</w:t>
       </w:r>
     </w:p>
     <w:tbl>
@@ -8950,15 +8947,14 @@
         <w:tblLook w:firstColumn="1" w:firstRow="1" w:lastColumn="0" w:lastRow="0" w:noHBand="0" w:noVBand="1" w:val="04A0"/>
       </w:tblPr>
       <w:tblGrid>
-        <w:gridCol w:w="2340"/>
-        <w:gridCol w:w="2340"/>
-        <w:gridCol w:w="2340"/>
-        <w:gridCol w:w="2340"/>
+        <w:gridCol w:w="3120"/>
+        <w:gridCol w:w="3120"/>
+        <w:gridCol w:w="3120"/>
       </w:tblGrid>
       <w:tr>
         <w:tc>
           <w:tcPr>
-            <w:tcW w:type="dxa" w:w="3744"/>
+            <w:tcW w:type="dxa" w:w="3024"/>
             <w:shd w:val="clear" w:color="auto" w:fill="D9E2F3"/>
           </w:tcPr>
           <w:p>
@@ -8973,13 +8969,13 @@
                 <w:i w:val="0"/>
                 <w:sz w:val="19"/>
               </w:rPr>
-              <w:t>Feature subset</w:t>
-            </w:r>
-          </w:p>
-        </w:tc>
-        <w:tc>
-          <w:tcPr>
-            <w:tcW w:type="dxa" w:w="2016"/>
+              <w:t>Attribute category</w:t>
+            </w:r>
+          </w:p>
+        </w:tc>
+        <w:tc>
+          <w:tcPr>
+            <w:tcW w:type="dxa" w:w="3456"/>
             <w:shd w:val="clear" w:color="auto" w:fill="D9E2F3"/>
           </w:tcPr>
           <w:p>
@@ -8994,13 +8990,13 @@
                 <w:i w:val="0"/>
                 <w:sz w:val="19"/>
               </w:rPr>
-              <w:t>No. of input columns</w:t>
-            </w:r>
-          </w:p>
-        </w:tc>
-        <w:tc>
-          <w:tcPr>
-            <w:tcW w:type="dxa" w:w="1440"/>
+              <w:t>Aggregate permutation importance</w:t>
+            </w:r>
+          </w:p>
+        </w:tc>
+        <w:tc>
+          <w:tcPr>
+            <w:tcW w:type="dxa" w:w="2448"/>
             <w:shd w:val="clear" w:color="auto" w:fill="D9E2F3"/>
           </w:tcPr>
           <w:p>
@@ -9015,28 +9011,7 @@
                 <w:i w:val="0"/>
                 <w:sz w:val="19"/>
               </w:rPr>
-              <w:t>Accuracy</w:t>
-            </w:r>
-          </w:p>
-        </w:tc>
-        <w:tc>
-          <w:tcPr>
-            <w:tcW w:type="dxa" w:w="1440"/>
-            <w:shd w:val="clear" w:color="auto" w:fill="D9E2F3"/>
-          </w:tcPr>
-          <w:p>
-            <w:pPr>
-              <w:spacing w:after="40" w:line="240" w:lineRule="auto"/>
-            </w:pPr>
-            <w:r/>
-            <w:r>
-              <w:rPr>
-                <w:rFonts w:ascii="Times New Roman" w:hAnsi="Times New Roman" w:cs="Times New Roman" w:eastAsia="Times New Roman"/>
-                <w:b/>
-                <w:i w:val="0"/>
-                <w:sz w:val="19"/>
-              </w:rPr>
-              <w:t>Macro F1</w:t>
+              <w:t>Share of total importance</w:t>
             </w:r>
           </w:p>
         </w:tc>
@@ -9044,7 +9019,7 @@
       <w:tr>
         <w:tc>
           <w:tcPr>
-            <w:tcW w:type="dxa" w:w="3744"/>
+            <w:tcW w:type="dxa" w:w="3024"/>
           </w:tcPr>
           <w:p>
             <w:pPr>
@@ -9058,13 +9033,13 @@
                 <w:i w:val="0"/>
                 <w:sz w:val="19"/>
               </w:rPr>
-              <w:t>All features</w:t>
-            </w:r>
-          </w:p>
-        </w:tc>
-        <w:tc>
-          <w:tcPr>
-            <w:tcW w:type="dxa" w:w="2016"/>
+              <w:t>Traffic</w:t>
+            </w:r>
+          </w:p>
+        </w:tc>
+        <w:tc>
+          <w:tcPr>
+            <w:tcW w:type="dxa" w:w="3456"/>
           </w:tcPr>
           <w:p>
             <w:pPr>
@@ -9078,13 +9053,13 @@
                 <w:i w:val="0"/>
                 <w:sz w:val="19"/>
               </w:rPr>
-              <w:t>65</w:t>
-            </w:r>
-          </w:p>
-        </w:tc>
-        <w:tc>
-          <w:tcPr>
-            <w:tcW w:type="dxa" w:w="1440"/>
+              <w:t>0.4192</w:t>
+            </w:r>
+          </w:p>
+        </w:tc>
+        <w:tc>
+          <w:tcPr>
+            <w:tcW w:type="dxa" w:w="2448"/>
           </w:tcPr>
           <w:p>
             <w:pPr>
@@ -9098,27 +9073,7 @@
                 <w:i w:val="0"/>
                 <w:sz w:val="19"/>
               </w:rPr>
-              <w:t>0.7824</w:t>
-            </w:r>
-          </w:p>
-        </w:tc>
-        <w:tc>
-          <w:tcPr>
-            <w:tcW w:type="dxa" w:w="1440"/>
-          </w:tcPr>
-          <w:p>
-            <w:pPr>
-              <w:spacing w:after="40" w:line="240" w:lineRule="auto"/>
-            </w:pPr>
-            <w:r/>
-            <w:r>
-              <w:rPr>
-                <w:rFonts w:ascii="Times New Roman" w:hAnsi="Times New Roman" w:cs="Times New Roman" w:eastAsia="Times New Roman"/>
-                <w:b w:val="0"/>
-                <w:i w:val="0"/>
-                <w:sz w:val="19"/>
-              </w:rPr>
-              <w:t>0.6412</w:t>
+              <w:t>41.44%</w:t>
             </w:r>
           </w:p>
         </w:tc>
@@ -9126,7 +9081,7 @@
       <w:tr>
         <w:tc>
           <w:tcPr>
-            <w:tcW w:type="dxa" w:w="3744"/>
+            <w:tcW w:type="dxa" w:w="3024"/>
           </w:tcPr>
           <w:p>
             <w:pPr>
@@ -9140,13 +9095,13 @@
                 <w:i w:val="0"/>
                 <w:sz w:val="19"/>
               </w:rPr>
-              <w:t>Top-20 features</w:t>
-            </w:r>
-          </w:p>
-        </w:tc>
-        <w:tc>
-          <w:tcPr>
-            <w:tcW w:type="dxa" w:w="2016"/>
+              <w:t>Environmental</w:t>
+            </w:r>
+          </w:p>
+        </w:tc>
+        <w:tc>
+          <w:tcPr>
+            <w:tcW w:type="dxa" w:w="3456"/>
           </w:tcPr>
           <w:p>
             <w:pPr>
@@ -9160,13 +9115,13 @@
                 <w:i w:val="0"/>
                 <w:sz w:val="19"/>
               </w:rPr>
-              <w:t>13</w:t>
-            </w:r>
-          </w:p>
-        </w:tc>
-        <w:tc>
-          <w:tcPr>
-            <w:tcW w:type="dxa" w:w="1440"/>
+              <w:t>0.2270</w:t>
+            </w:r>
+          </w:p>
+        </w:tc>
+        <w:tc>
+          <w:tcPr>
+            <w:tcW w:type="dxa" w:w="2448"/>
           </w:tcPr>
           <w:p>
             <w:pPr>
@@ -9180,27 +9135,7 @@
                 <w:i w:val="0"/>
                 <w:sz w:val="19"/>
               </w:rPr>
-              <w:t>0.7946</w:t>
-            </w:r>
-          </w:p>
-        </w:tc>
-        <w:tc>
-          <w:tcPr>
-            <w:tcW w:type="dxa" w:w="1440"/>
-          </w:tcPr>
-          <w:p>
-            <w:pPr>
-              <w:spacing w:after="40" w:line="240" w:lineRule="auto"/>
-            </w:pPr>
-            <w:r/>
-            <w:r>
-              <w:rPr>
-                <w:rFonts w:ascii="Times New Roman" w:hAnsi="Times New Roman" w:cs="Times New Roman" w:eastAsia="Times New Roman"/>
-                <w:b w:val="0"/>
-                <w:i w:val="0"/>
-                <w:sz w:val="19"/>
-              </w:rPr>
-              <w:t>0.7213</w:t>
+              <w:t>22.44%</w:t>
             </w:r>
           </w:p>
         </w:tc>
@@ -9208,7 +9143,7 @@
       <w:tr>
         <w:tc>
           <w:tcPr>
-            <w:tcW w:type="dxa" w:w="3744"/>
+            <w:tcW w:type="dxa" w:w="3024"/>
           </w:tcPr>
           <w:p>
             <w:pPr>
@@ -9222,13 +9157,13 @@
                 <w:i w:val="0"/>
                 <w:sz w:val="19"/>
               </w:rPr>
-              <w:t>Top-10 features</w:t>
-            </w:r>
-          </w:p>
-        </w:tc>
-        <w:tc>
-          <w:tcPr>
-            <w:tcW w:type="dxa" w:w="2016"/>
+              <w:t>Spatial / location</w:t>
+            </w:r>
+          </w:p>
+        </w:tc>
+        <w:tc>
+          <w:tcPr>
+            <w:tcW w:type="dxa" w:w="3456"/>
           </w:tcPr>
           <w:p>
             <w:pPr>
@@ -9242,13 +9177,13 @@
                 <w:i w:val="0"/>
                 <w:sz w:val="19"/>
               </w:rPr>
-              <w:t>7</w:t>
-            </w:r>
-          </w:p>
-        </w:tc>
-        <w:tc>
-          <w:tcPr>
-            <w:tcW w:type="dxa" w:w="1440"/>
+              <w:t>0.1691</w:t>
+            </w:r>
+          </w:p>
+        </w:tc>
+        <w:tc>
+          <w:tcPr>
+            <w:tcW w:type="dxa" w:w="2448"/>
           </w:tcPr>
           <w:p>
             <w:pPr>
@@ -9262,27 +9197,7 @@
                 <w:i w:val="0"/>
                 <w:sz w:val="19"/>
               </w:rPr>
-              <w:t>0.7832</w:t>
-            </w:r>
-          </w:p>
-        </w:tc>
-        <w:tc>
-          <w:tcPr>
-            <w:tcW w:type="dxa" w:w="1440"/>
-          </w:tcPr>
-          <w:p>
-            <w:pPr>
-              <w:spacing w:after="40" w:line="240" w:lineRule="auto"/>
-            </w:pPr>
-            <w:r/>
-            <w:r>
-              <w:rPr>
-                <w:rFonts w:ascii="Times New Roman" w:hAnsi="Times New Roman" w:cs="Times New Roman" w:eastAsia="Times New Roman"/>
-                <w:b w:val="0"/>
-                <w:i w:val="0"/>
-                <w:sz w:val="19"/>
-              </w:rPr>
-              <w:t>0.7167</w:t>
+              <w:t>16.72%</w:t>
             </w:r>
           </w:p>
         </w:tc>
@@ -9290,7 +9205,7 @@
       <w:tr>
         <w:tc>
           <w:tcPr>
-            <w:tcW w:type="dxa" w:w="3744"/>
+            <w:tcW w:type="dxa" w:w="3024"/>
           </w:tcPr>
           <w:p>
             <w:pPr>
@@ -9304,25 +9219,928 @@
                 <w:i w:val="0"/>
                 <w:sz w:val="19"/>
               </w:rPr>
+              <w:t>Context</w:t>
+            </w:r>
+          </w:p>
+        </w:tc>
+        <w:tc>
+          <w:tcPr>
+            <w:tcW w:type="dxa" w:w="3456"/>
+          </w:tcPr>
+          <w:p>
+            <w:pPr>
+              <w:spacing w:after="40" w:line="240" w:lineRule="auto"/>
+            </w:pPr>
+            <w:r/>
+            <w:r>
+              <w:rPr>
+                <w:rFonts w:ascii="Times New Roman" w:hAnsi="Times New Roman" w:cs="Times New Roman" w:eastAsia="Times New Roman"/>
+                <w:b w:val="0"/>
+                <w:i w:val="0"/>
+                <w:sz w:val="19"/>
+              </w:rPr>
+              <w:t>0.1249</w:t>
+            </w:r>
+          </w:p>
+        </w:tc>
+        <w:tc>
+          <w:tcPr>
+            <w:tcW w:type="dxa" w:w="2448"/>
+          </w:tcPr>
+          <w:p>
+            <w:pPr>
+              <w:spacing w:after="40" w:line="240" w:lineRule="auto"/>
+            </w:pPr>
+            <w:r/>
+            <w:r>
+              <w:rPr>
+                <w:rFonts w:ascii="Times New Roman" w:hAnsi="Times New Roman" w:cs="Times New Roman" w:eastAsia="Times New Roman"/>
+                <w:b w:val="0"/>
+                <w:i w:val="0"/>
+                <w:sz w:val="19"/>
+              </w:rPr>
+              <w:t>12.35%</w:t>
+            </w:r>
+          </w:p>
+        </w:tc>
+      </w:tr>
+      <w:tr>
+        <w:tc>
+          <w:tcPr>
+            <w:tcW w:type="dxa" w:w="3024"/>
+          </w:tcPr>
+          <w:p>
+            <w:pPr>
+              <w:spacing w:after="40" w:line="240" w:lineRule="auto"/>
+            </w:pPr>
+            <w:r/>
+            <w:r>
+              <w:rPr>
+                <w:rFonts w:ascii="Times New Roman" w:hAnsi="Times New Roman" w:cs="Times New Roman" w:eastAsia="Times New Roman"/>
+                <w:b w:val="0"/>
+                <w:i w:val="0"/>
+                <w:sz w:val="19"/>
+              </w:rPr>
+              <w:t>Road-related</w:t>
+            </w:r>
+          </w:p>
+        </w:tc>
+        <w:tc>
+          <w:tcPr>
+            <w:tcW w:type="dxa" w:w="3456"/>
+          </w:tcPr>
+          <w:p>
+            <w:pPr>
+              <w:spacing w:after="40" w:line="240" w:lineRule="auto"/>
+            </w:pPr>
+            <w:r/>
+            <w:r>
+              <w:rPr>
+                <w:rFonts w:ascii="Times New Roman" w:hAnsi="Times New Roman" w:cs="Times New Roman" w:eastAsia="Times New Roman"/>
+                <w:b w:val="0"/>
+                <w:i w:val="0"/>
+                <w:sz w:val="19"/>
+              </w:rPr>
+              <w:t>0.0237</w:t>
+            </w:r>
+          </w:p>
+        </w:tc>
+        <w:tc>
+          <w:tcPr>
+            <w:tcW w:type="dxa" w:w="2448"/>
+          </w:tcPr>
+          <w:p>
+            <w:pPr>
+              <w:spacing w:after="40" w:line="240" w:lineRule="auto"/>
+            </w:pPr>
+            <w:r/>
+            <w:r>
+              <w:rPr>
+                <w:rFonts w:ascii="Times New Roman" w:hAnsi="Times New Roman" w:cs="Times New Roman" w:eastAsia="Times New Roman"/>
+                <w:b w:val="0"/>
+                <w:i w:val="0"/>
+                <w:sz w:val="19"/>
+              </w:rPr>
+              <w:t>2.34%</w:t>
+            </w:r>
+          </w:p>
+        </w:tc>
+      </w:tr>
+      <w:tr>
+        <w:tc>
+          <w:tcPr>
+            <w:tcW w:type="dxa" w:w="3024"/>
+          </w:tcPr>
+          <w:p>
+            <w:pPr>
+              <w:spacing w:after="40" w:line="240" w:lineRule="auto"/>
+            </w:pPr>
+            <w:r/>
+            <w:r>
+              <w:rPr>
+                <w:rFonts w:ascii="Times New Roman" w:hAnsi="Times New Roman" w:cs="Times New Roman" w:eastAsia="Times New Roman"/>
+                <w:b w:val="0"/>
+                <w:i w:val="0"/>
+                <w:sz w:val="19"/>
+              </w:rPr>
+              <w:t>Infrastructure</w:t>
+            </w:r>
+          </w:p>
+        </w:tc>
+        <w:tc>
+          <w:tcPr>
+            <w:tcW w:type="dxa" w:w="3456"/>
+          </w:tcPr>
+          <w:p>
+            <w:pPr>
+              <w:spacing w:after="40" w:line="240" w:lineRule="auto"/>
+            </w:pPr>
+            <w:r/>
+            <w:r>
+              <w:rPr>
+                <w:rFonts w:ascii="Times New Roman" w:hAnsi="Times New Roman" w:cs="Times New Roman" w:eastAsia="Times New Roman"/>
+                <w:b w:val="0"/>
+                <w:i w:val="0"/>
+                <w:sz w:val="19"/>
+              </w:rPr>
+              <w:t>0.0199</w:t>
+            </w:r>
+          </w:p>
+        </w:tc>
+        <w:tc>
+          <w:tcPr>
+            <w:tcW w:type="dxa" w:w="2448"/>
+          </w:tcPr>
+          <w:p>
+            <w:pPr>
+              <w:spacing w:after="40" w:line="240" w:lineRule="auto"/>
+            </w:pPr>
+            <w:r/>
+            <w:r>
+              <w:rPr>
+                <w:rFonts w:ascii="Times New Roman" w:hAnsi="Times New Roman" w:cs="Times New Roman" w:eastAsia="Times New Roman"/>
+                <w:b w:val="0"/>
+                <w:i w:val="0"/>
+                <w:sz w:val="19"/>
+              </w:rPr>
+              <w:t>1.97%</w:t>
+            </w:r>
+          </w:p>
+        </w:tc>
+      </w:tr>
+      <w:tr>
+        <w:tc>
+          <w:tcPr>
+            <w:tcW w:type="dxa" w:w="3024"/>
+          </w:tcPr>
+          <w:p>
+            <w:pPr>
+              <w:spacing w:after="40" w:line="240" w:lineRule="auto"/>
+            </w:pPr>
+            <w:r/>
+            <w:r>
+              <w:rPr>
+                <w:rFonts w:ascii="Times New Roman" w:hAnsi="Times New Roman" w:cs="Times New Roman" w:eastAsia="Times New Roman"/>
+                <w:b w:val="0"/>
+                <w:i w:val="0"/>
+                <w:sz w:val="19"/>
+              </w:rPr>
+              <w:t>Temporal</w:t>
+            </w:r>
+          </w:p>
+        </w:tc>
+        <w:tc>
+          <w:tcPr>
+            <w:tcW w:type="dxa" w:w="3456"/>
+          </w:tcPr>
+          <w:p>
+            <w:pPr>
+              <w:spacing w:after="40" w:line="240" w:lineRule="auto"/>
+            </w:pPr>
+            <w:r/>
+            <w:r>
+              <w:rPr>
+                <w:rFonts w:ascii="Times New Roman" w:hAnsi="Times New Roman" w:cs="Times New Roman" w:eastAsia="Times New Roman"/>
+                <w:b w:val="0"/>
+                <w:i w:val="0"/>
+                <w:sz w:val="19"/>
+              </w:rPr>
+              <w:t>0.0124</w:t>
+            </w:r>
+          </w:p>
+        </w:tc>
+        <w:tc>
+          <w:tcPr>
+            <w:tcW w:type="dxa" w:w="2448"/>
+          </w:tcPr>
+          <w:p>
+            <w:pPr>
+              <w:spacing w:after="40" w:line="240" w:lineRule="auto"/>
+            </w:pPr>
+            <w:r/>
+            <w:r>
+              <w:rPr>
+                <w:rFonts w:ascii="Times New Roman" w:hAnsi="Times New Roman" w:cs="Times New Roman" w:eastAsia="Times New Roman"/>
+                <w:b w:val="0"/>
+                <w:i w:val="0"/>
+                <w:sz w:val="19"/>
+              </w:rPr>
+              <w:t>1.23%</w:t>
+            </w:r>
+          </w:p>
+        </w:tc>
+      </w:tr>
+      <w:tr>
+        <w:tc>
+          <w:tcPr>
+            <w:tcW w:type="dxa" w:w="3024"/>
+          </w:tcPr>
+          <w:p>
+            <w:pPr>
+              <w:spacing w:after="40" w:line="240" w:lineRule="auto"/>
+            </w:pPr>
+            <w:r/>
+            <w:r>
+              <w:rPr>
+                <w:rFonts w:ascii="Times New Roman" w:hAnsi="Times New Roman" w:cs="Times New Roman" w:eastAsia="Times New Roman"/>
+                <w:b w:val="0"/>
+                <w:i w:val="0"/>
+                <w:sz w:val="19"/>
+              </w:rPr>
+              <w:t>Incident type</w:t>
+            </w:r>
+          </w:p>
+        </w:tc>
+        <w:tc>
+          <w:tcPr>
+            <w:tcW w:type="dxa" w:w="3456"/>
+          </w:tcPr>
+          <w:p>
+            <w:pPr>
+              <w:spacing w:after="40" w:line="240" w:lineRule="auto"/>
+            </w:pPr>
+            <w:r/>
+            <w:r>
+              <w:rPr>
+                <w:rFonts w:ascii="Times New Roman" w:hAnsi="Times New Roman" w:cs="Times New Roman" w:eastAsia="Times New Roman"/>
+                <w:b w:val="0"/>
+                <w:i w:val="0"/>
+                <w:sz w:val="19"/>
+              </w:rPr>
+              <w:t>0.0077</w:t>
+            </w:r>
+          </w:p>
+        </w:tc>
+        <w:tc>
+          <w:tcPr>
+            <w:tcW w:type="dxa" w:w="2448"/>
+          </w:tcPr>
+          <w:p>
+            <w:pPr>
+              <w:spacing w:after="40" w:line="240" w:lineRule="auto"/>
+            </w:pPr>
+            <w:r/>
+            <w:r>
+              <w:rPr>
+                <w:rFonts w:ascii="Times New Roman" w:hAnsi="Times New Roman" w:cs="Times New Roman" w:eastAsia="Times New Roman"/>
+                <w:b w:val="0"/>
+                <w:i w:val="0"/>
+                <w:sz w:val="19"/>
+              </w:rPr>
+              <w:t>0.76%</w:t>
+            </w:r>
+          </w:p>
+        </w:tc>
+      </w:tr>
+      <w:tr>
+        <w:tc>
+          <w:tcPr>
+            <w:tcW w:type="dxa" w:w="3024"/>
+          </w:tcPr>
+          <w:p>
+            <w:pPr>
+              <w:spacing w:after="40" w:line="240" w:lineRule="auto"/>
+            </w:pPr>
+            <w:r/>
+            <w:r>
+              <w:rPr>
+                <w:rFonts w:ascii="Times New Roman" w:hAnsi="Times New Roman" w:cs="Times New Roman" w:eastAsia="Times New Roman"/>
+                <w:b w:val="0"/>
+                <w:i w:val="0"/>
+                <w:sz w:val="19"/>
+              </w:rPr>
+              <w:t>Proximity</w:t>
+            </w:r>
+          </w:p>
+        </w:tc>
+        <w:tc>
+          <w:tcPr>
+            <w:tcW w:type="dxa" w:w="3456"/>
+          </w:tcPr>
+          <w:p>
+            <w:pPr>
+              <w:spacing w:after="40" w:line="240" w:lineRule="auto"/>
+            </w:pPr>
+            <w:r/>
+            <w:r>
+              <w:rPr>
+                <w:rFonts w:ascii="Times New Roman" w:hAnsi="Times New Roman" w:cs="Times New Roman" w:eastAsia="Times New Roman"/>
+                <w:b w:val="0"/>
+                <w:i w:val="0"/>
+                <w:sz w:val="19"/>
+              </w:rPr>
+              <w:t>0.0077</w:t>
+            </w:r>
+          </w:p>
+        </w:tc>
+        <w:tc>
+          <w:tcPr>
+            <w:tcW w:type="dxa" w:w="2448"/>
+          </w:tcPr>
+          <w:p>
+            <w:pPr>
+              <w:spacing w:after="40" w:line="240" w:lineRule="auto"/>
+            </w:pPr>
+            <w:r/>
+            <w:r>
+              <w:rPr>
+                <w:rFonts w:ascii="Times New Roman" w:hAnsi="Times New Roman" w:cs="Times New Roman" w:eastAsia="Times New Roman"/>
+                <w:b w:val="0"/>
+                <w:i w:val="0"/>
+                <w:sz w:val="19"/>
+              </w:rPr>
+              <w:t>0.76%</w:t>
+            </w:r>
+          </w:p>
+        </w:tc>
+      </w:tr>
+    </w:tbl>
+    <w:p>
+      <w:pPr>
+        <w:spacing w:lineRule="auto" w:line="240" w:after="80"/>
+      </w:pPr>
+    </w:p>
+    <w:p>
+      <w:pPr>
+        <w:spacing w:lineRule="auto" w:line="360" w:after="120"/>
+      </w:pPr>
+      <w:r>
+        <w:rPr>
+          <w:rFonts w:ascii="Times New Roman" w:hAnsi="Times New Roman" w:cs="Times New Roman" w:eastAsia="Times New Roman"/>
+          <w:b w:val="0"/>
+          <w:i w:val="0"/>
+          <w:sz w:val="22"/>
+        </w:rPr>
+        <w:t>The aggregation sharpens the earlier finding. Traffic variables account for 41.44% of the total predictive importance, environmental variables for 22.44%, spatial/location attributes for 16.72% and context flags (road works, holidays) for 12.35%. Road-related, infrastructure, temporal, incident-type and proximity variables together account for only 2.34%, 1.97%, 1.23% and under 1% respectively.</w:t>
+      </w:r>
+    </w:p>
+    <w:p>
+      <w:pPr>
+        <w:spacing w:lineRule="auto" w:line="360" w:after="120"/>
+      </w:pPr>
+      <w:r>
+        <w:rPr>
+          <w:rFonts w:ascii="Times New Roman" w:hAnsi="Times New Roman" w:cs="Times New Roman" w:eastAsia="Times New Roman"/>
+          <w:b w:val="0"/>
+          <w:i w:val="0"/>
+          <w:sz w:val="22"/>
+        </w:rPr>
+        <w:t>This directly answers the question the brief poses about environmental, temporal, spatial and road-related variables. Environmental conditions matter a great deal — adverse weather raises severity, consistent with Section 3.3 — and location matters too, largely through the accident history of a place. Temporal variables, by contrast, contribute almost nothing: the time of day and the day of the week do not meaningfully predict severity in this dataset, which is a useful negative result. The operational conclusion is that a monitoring system can obtain most of its predictive value from a small number of traffic and location measurements rather than from an expensive, network-wide instrumentation programme.</w:t>
+      </w:r>
+    </w:p>
+    <w:p>
+      <w:pPr>
+        <w:pStyle w:val="Heading2"/>
+        <w:keepNext/>
+        <w:spacing w:before="200" w:after="120" w:lineRule="auto" w:line="360"/>
+      </w:pPr>
+      <w:r>
+        <w:rPr>
+          <w:rFonts w:ascii="Times New Roman" w:hAnsi="Times New Roman" w:cs="Times New Roman" w:eastAsia="Times New Roman"/>
+          <w:b/>
+          <w:i w:val="0"/>
+          <w:color w:val="000000"/>
+          <w:sz w:val="24"/>
+        </w:rPr>
+        <w:t>4.5 Feature-subset ablation study</w:t>
+      </w:r>
+    </w:p>
+    <w:p>
+      <w:pPr>
+        <w:spacing w:lineRule="auto" w:line="360" w:after="120"/>
+      </w:pPr>
+      <w:r>
+        <w:rPr>
+          <w:rFonts w:ascii="Times New Roman" w:hAnsi="Times New Roman" w:cs="Times New Roman" w:eastAsia="Times New Roman"/>
+          <w:b w:val="0"/>
+          <w:i w:val="0"/>
+          <w:sz w:val="22"/>
+        </w:rPr>
+        <w:t>The brief requires the impact of different feature subsets to be assessed on **both** the supervised and the unsupervised models, so the study is run twice on identical subsets. A fixed random forest is trained four times with unchanged settings, and k-means is re-run on the standardised numeric features of the same four subsets at the selected k = 4, with the silhouette score as the clustering-quality measure. Table 10 and Figure 10 present the results.</w:t>
+      </w:r>
+    </w:p>
+    <w:p>
+      <w:pPr>
+        <w:pStyle w:val="Caption"/>
+        <w:keepNext/>
+        <w:spacing w:lineRule="auto" w:line="240" w:after="120" w:before="40"/>
+        <w:jc w:val="left"/>
+      </w:pPr>
+      <w:r>
+        <w:rPr>
+          <w:rFonts w:ascii="Times New Roman" w:hAnsi="Times New Roman" w:cs="Times New Roman" w:eastAsia="Times New Roman"/>
+          <w:b w:val="0"/>
+          <w:i w:val="0"/>
+          <w:sz w:val="20"/>
+        </w:rPr>
+        <w:t xml:space="preserve">Table </w:t>
+      </w:r>
+      <w:r>
+        <w:rPr>
+          <w:rFonts w:ascii="Times New Roman" w:hAnsi="Times New Roman" w:cs="Times New Roman" w:eastAsia="Times New Roman"/>
+          <w:b w:val="0"/>
+          <w:i w:val="0"/>
+          <w:sz w:val="20"/>
+        </w:rPr>
+        <w:fldChar w:fldCharType="begin"/>
+        <w:instrText xml:space="preserve"> SEQ Table \* ARABIC </w:instrText>
+        <w:fldChar w:fldCharType="separate"/>
+        <w:t>10</w:t>
+        <w:fldChar w:fldCharType="end"/>
+      </w:r>
+      <w:r>
+        <w:rPr>
+          <w:rFonts w:ascii="Times New Roman" w:hAnsi="Times New Roman" w:cs="Times New Roman" w:eastAsia="Times New Roman"/>
+          <w:b w:val="0"/>
+          <w:i w:val="0"/>
+          <w:sz w:val="20"/>
+        </w:rPr>
+        <w:t>. Feature-subset ablation study: effect on the supervised and unsupervised models</w:t>
+      </w:r>
+    </w:p>
+    <w:tbl>
+      <w:tblPr>
+        <w:tblStyle w:val="TableGrid"/>
+        <w:tblW w:type="auto" w:w="0"/>
+        <w:jc w:val="center"/>
+        <w:tblLook w:firstColumn="1" w:firstRow="1" w:lastColumn="0" w:lastRow="0" w:noHBand="0" w:noVBand="1" w:val="04A0"/>
+      </w:tblPr>
+      <w:tblGrid>
+        <w:gridCol w:w="1872"/>
+        <w:gridCol w:w="1872"/>
+        <w:gridCol w:w="1872"/>
+        <w:gridCol w:w="1872"/>
+        <w:gridCol w:w="1872"/>
+      </w:tblGrid>
+      <w:tr>
+        <w:tc>
+          <w:tcPr>
+            <w:tcW w:type="dxa" w:w="3312"/>
+            <w:shd w:val="clear" w:color="auto" w:fill="D9E2F3"/>
+          </w:tcPr>
+          <w:p>
+            <w:pPr>
+              <w:spacing w:after="40" w:line="240" w:lineRule="auto"/>
+            </w:pPr>
+            <w:r/>
+            <w:r>
+              <w:rPr>
+                <w:rFonts w:ascii="Times New Roman" w:hAnsi="Times New Roman" w:cs="Times New Roman" w:eastAsia="Times New Roman"/>
+                <w:b/>
+                <w:i w:val="0"/>
+                <w:sz w:val="18"/>
+              </w:rPr>
+              <w:t>Feature subset</w:t>
+            </w:r>
+          </w:p>
+        </w:tc>
+        <w:tc>
+          <w:tcPr>
+            <w:tcW w:type="dxa" w:w="1512"/>
+            <w:shd w:val="clear" w:color="auto" w:fill="D9E2F3"/>
+          </w:tcPr>
+          <w:p>
+            <w:pPr>
+              <w:spacing w:after="40" w:line="240" w:lineRule="auto"/>
+            </w:pPr>
+            <w:r/>
+            <w:r>
+              <w:rPr>
+                <w:rFonts w:ascii="Times New Roman" w:hAnsi="Times New Roman" w:cs="Times New Roman" w:eastAsia="Times New Roman"/>
+                <w:b/>
+                <w:i w:val="0"/>
+                <w:sz w:val="18"/>
+              </w:rPr>
+              <w:t>No. of input columns</w:t>
+            </w:r>
+          </w:p>
+        </w:tc>
+        <w:tc>
+          <w:tcPr>
+            <w:tcW w:type="dxa" w:w="1224"/>
+            <w:shd w:val="clear" w:color="auto" w:fill="D9E2F3"/>
+          </w:tcPr>
+          <w:p>
+            <w:pPr>
+              <w:spacing w:after="40" w:line="240" w:lineRule="auto"/>
+            </w:pPr>
+            <w:r/>
+            <w:r>
+              <w:rPr>
+                <w:rFonts w:ascii="Times New Roman" w:hAnsi="Times New Roman" w:cs="Times New Roman" w:eastAsia="Times New Roman"/>
+                <w:b/>
+                <w:i w:val="0"/>
+                <w:sz w:val="18"/>
+              </w:rPr>
+              <w:t>Accuracy</w:t>
+            </w:r>
+          </w:p>
+        </w:tc>
+        <w:tc>
+          <w:tcPr>
+            <w:tcW w:type="dxa" w:w="1224"/>
+            <w:shd w:val="clear" w:color="auto" w:fill="D9E2F3"/>
+          </w:tcPr>
+          <w:p>
+            <w:pPr>
+              <w:spacing w:after="40" w:line="240" w:lineRule="auto"/>
+            </w:pPr>
+            <w:r/>
+            <w:r>
+              <w:rPr>
+                <w:rFonts w:ascii="Times New Roman" w:hAnsi="Times New Roman" w:cs="Times New Roman" w:eastAsia="Times New Roman"/>
+                <w:b/>
+                <w:i w:val="0"/>
+                <w:sz w:val="18"/>
+              </w:rPr>
+              <w:t>Macro F1</w:t>
+            </w:r>
+          </w:p>
+        </w:tc>
+        <w:tc>
+          <w:tcPr>
+            <w:tcW w:type="dxa" w:w="2088"/>
+            <w:shd w:val="clear" w:color="auto" w:fill="D9E2F3"/>
+          </w:tcPr>
+          <w:p>
+            <w:pPr>
+              <w:spacing w:after="40" w:line="240" w:lineRule="auto"/>
+            </w:pPr>
+            <w:r/>
+            <w:r>
+              <w:rPr>
+                <w:rFonts w:ascii="Times New Roman" w:hAnsi="Times New Roman" w:cs="Times New Roman" w:eastAsia="Times New Roman"/>
+                <w:b/>
+                <w:i w:val="0"/>
+                <w:sz w:val="18"/>
+              </w:rPr>
+              <w:t>Silhouette (k = 4, unsupervised)</w:t>
+            </w:r>
+          </w:p>
+        </w:tc>
+      </w:tr>
+      <w:tr>
+        <w:tc>
+          <w:tcPr>
+            <w:tcW w:type="dxa" w:w="3312"/>
+          </w:tcPr>
+          <w:p>
+            <w:pPr>
+              <w:spacing w:after="40" w:line="240" w:lineRule="auto"/>
+            </w:pPr>
+            <w:r/>
+            <w:r>
+              <w:rPr>
+                <w:rFonts w:ascii="Times New Roman" w:hAnsi="Times New Roman" w:cs="Times New Roman" w:eastAsia="Times New Roman"/>
+                <w:b w:val="0"/>
+                <w:i w:val="0"/>
+                <w:sz w:val="18"/>
+              </w:rPr>
+              <w:t>All features</w:t>
+            </w:r>
+          </w:p>
+        </w:tc>
+        <w:tc>
+          <w:tcPr>
+            <w:tcW w:type="dxa" w:w="1512"/>
+          </w:tcPr>
+          <w:p>
+            <w:pPr>
+              <w:spacing w:after="40" w:line="240" w:lineRule="auto"/>
+            </w:pPr>
+            <w:r/>
+            <w:r>
+              <w:rPr>
+                <w:rFonts w:ascii="Times New Roman" w:hAnsi="Times New Roman" w:cs="Times New Roman" w:eastAsia="Times New Roman"/>
+                <w:b w:val="0"/>
+                <w:i w:val="0"/>
+                <w:sz w:val="18"/>
+              </w:rPr>
+              <w:t>65</w:t>
+            </w:r>
+          </w:p>
+        </w:tc>
+        <w:tc>
+          <w:tcPr>
+            <w:tcW w:type="dxa" w:w="1224"/>
+          </w:tcPr>
+          <w:p>
+            <w:pPr>
+              <w:spacing w:after="40" w:line="240" w:lineRule="auto"/>
+            </w:pPr>
+            <w:r/>
+            <w:r>
+              <w:rPr>
+                <w:rFonts w:ascii="Times New Roman" w:hAnsi="Times New Roman" w:cs="Times New Roman" w:eastAsia="Times New Roman"/>
+                <w:b w:val="0"/>
+                <w:i w:val="0"/>
+                <w:sz w:val="18"/>
+              </w:rPr>
+              <w:t>0.7824</w:t>
+            </w:r>
+          </w:p>
+        </w:tc>
+        <w:tc>
+          <w:tcPr>
+            <w:tcW w:type="dxa" w:w="1224"/>
+          </w:tcPr>
+          <w:p>
+            <w:pPr>
+              <w:spacing w:after="40" w:line="240" w:lineRule="auto"/>
+            </w:pPr>
+            <w:r/>
+            <w:r>
+              <w:rPr>
+                <w:rFonts w:ascii="Times New Roman" w:hAnsi="Times New Roman" w:cs="Times New Roman" w:eastAsia="Times New Roman"/>
+                <w:b w:val="0"/>
+                <w:i w:val="0"/>
+                <w:sz w:val="18"/>
+              </w:rPr>
+              <w:t>0.6412</w:t>
+            </w:r>
+          </w:p>
+        </w:tc>
+        <w:tc>
+          <w:tcPr>
+            <w:tcW w:type="dxa" w:w="2088"/>
+          </w:tcPr>
+          <w:p>
+            <w:pPr>
+              <w:spacing w:after="40" w:line="240" w:lineRule="auto"/>
+            </w:pPr>
+            <w:r/>
+            <w:r>
+              <w:rPr>
+                <w:rFonts w:ascii="Times New Roman" w:hAnsi="Times New Roman" w:cs="Times New Roman" w:eastAsia="Times New Roman"/>
+                <w:b w:val="0"/>
+                <w:i w:val="0"/>
+                <w:sz w:val="18"/>
+              </w:rPr>
+              <w:t>0.0205</w:t>
+            </w:r>
+          </w:p>
+        </w:tc>
+      </w:tr>
+      <w:tr>
+        <w:tc>
+          <w:tcPr>
+            <w:tcW w:type="dxa" w:w="3312"/>
+          </w:tcPr>
+          <w:p>
+            <w:pPr>
+              <w:spacing w:after="40" w:line="240" w:lineRule="auto"/>
+            </w:pPr>
+            <w:r/>
+            <w:r>
+              <w:rPr>
+                <w:rFonts w:ascii="Times New Roman" w:hAnsi="Times New Roman" w:cs="Times New Roman" w:eastAsia="Times New Roman"/>
+                <w:b w:val="0"/>
+                <w:i w:val="0"/>
+                <w:sz w:val="18"/>
+              </w:rPr>
+              <w:t>Top-20 features</w:t>
+            </w:r>
+          </w:p>
+        </w:tc>
+        <w:tc>
+          <w:tcPr>
+            <w:tcW w:type="dxa" w:w="1512"/>
+          </w:tcPr>
+          <w:p>
+            <w:pPr>
+              <w:spacing w:after="40" w:line="240" w:lineRule="auto"/>
+            </w:pPr>
+            <w:r/>
+            <w:r>
+              <w:rPr>
+                <w:rFonts w:ascii="Times New Roman" w:hAnsi="Times New Roman" w:cs="Times New Roman" w:eastAsia="Times New Roman"/>
+                <w:b w:val="0"/>
+                <w:i w:val="0"/>
+                <w:sz w:val="18"/>
+              </w:rPr>
+              <w:t>20</w:t>
+            </w:r>
+          </w:p>
+        </w:tc>
+        <w:tc>
+          <w:tcPr>
+            <w:tcW w:type="dxa" w:w="1224"/>
+          </w:tcPr>
+          <w:p>
+            <w:pPr>
+              <w:spacing w:after="40" w:line="240" w:lineRule="auto"/>
+            </w:pPr>
+            <w:r/>
+            <w:r>
+              <w:rPr>
+                <w:rFonts w:ascii="Times New Roman" w:hAnsi="Times New Roman" w:cs="Times New Roman" w:eastAsia="Times New Roman"/>
+                <w:b w:val="0"/>
+                <w:i w:val="0"/>
+                <w:sz w:val="18"/>
+              </w:rPr>
+              <w:t>0.7919</w:t>
+            </w:r>
+          </w:p>
+        </w:tc>
+        <w:tc>
+          <w:tcPr>
+            <w:tcW w:type="dxa" w:w="1224"/>
+          </w:tcPr>
+          <w:p>
+            <w:pPr>
+              <w:spacing w:after="40" w:line="240" w:lineRule="auto"/>
+            </w:pPr>
+            <w:r/>
+            <w:r>
+              <w:rPr>
+                <w:rFonts w:ascii="Times New Roman" w:hAnsi="Times New Roman" w:cs="Times New Roman" w:eastAsia="Times New Roman"/>
+                <w:b w:val="0"/>
+                <w:i w:val="0"/>
+                <w:sz w:val="18"/>
+              </w:rPr>
+              <w:t>0.7006</w:t>
+            </w:r>
+          </w:p>
+        </w:tc>
+        <w:tc>
+          <w:tcPr>
+            <w:tcW w:type="dxa" w:w="2088"/>
+          </w:tcPr>
+          <w:p>
+            <w:pPr>
+              <w:spacing w:after="40" w:line="240" w:lineRule="auto"/>
+            </w:pPr>
+            <w:r/>
+            <w:r>
+              <w:rPr>
+                <w:rFonts w:ascii="Times New Roman" w:hAnsi="Times New Roman" w:cs="Times New Roman" w:eastAsia="Times New Roman"/>
+                <w:b w:val="0"/>
+                <w:i w:val="0"/>
+                <w:sz w:val="18"/>
+              </w:rPr>
+              <w:t>0.0473</w:t>
+            </w:r>
+          </w:p>
+        </w:tc>
+      </w:tr>
+      <w:tr>
+        <w:tc>
+          <w:tcPr>
+            <w:tcW w:type="dxa" w:w="3312"/>
+          </w:tcPr>
+          <w:p>
+            <w:pPr>
+              <w:spacing w:after="40" w:line="240" w:lineRule="auto"/>
+            </w:pPr>
+            <w:r/>
+            <w:r>
+              <w:rPr>
+                <w:rFonts w:ascii="Times New Roman" w:hAnsi="Times New Roman" w:cs="Times New Roman" w:eastAsia="Times New Roman"/>
+                <w:b w:val="0"/>
+                <w:i w:val="0"/>
+                <w:sz w:val="18"/>
+              </w:rPr>
+              <w:t>Top-10 features</w:t>
+            </w:r>
+          </w:p>
+        </w:tc>
+        <w:tc>
+          <w:tcPr>
+            <w:tcW w:type="dxa" w:w="1512"/>
+          </w:tcPr>
+          <w:p>
+            <w:pPr>
+              <w:spacing w:after="40" w:line="240" w:lineRule="auto"/>
+            </w:pPr>
+            <w:r/>
+            <w:r>
+              <w:rPr>
+                <w:rFonts w:ascii="Times New Roman" w:hAnsi="Times New Roman" w:cs="Times New Roman" w:eastAsia="Times New Roman"/>
+                <w:b w:val="0"/>
+                <w:i w:val="0"/>
+                <w:sz w:val="18"/>
+              </w:rPr>
+              <w:t>10</w:t>
+            </w:r>
+          </w:p>
+        </w:tc>
+        <w:tc>
+          <w:tcPr>
+            <w:tcW w:type="dxa" w:w="1224"/>
+          </w:tcPr>
+          <w:p>
+            <w:pPr>
+              <w:spacing w:after="40" w:line="240" w:lineRule="auto"/>
+            </w:pPr>
+            <w:r/>
+            <w:r>
+              <w:rPr>
+                <w:rFonts w:ascii="Times New Roman" w:hAnsi="Times New Roman" w:cs="Times New Roman" w:eastAsia="Times New Roman"/>
+                <w:b w:val="0"/>
+                <w:i w:val="0"/>
+                <w:sz w:val="18"/>
+              </w:rPr>
+              <w:t>0.7887</w:t>
+            </w:r>
+          </w:p>
+        </w:tc>
+        <w:tc>
+          <w:tcPr>
+            <w:tcW w:type="dxa" w:w="1224"/>
+          </w:tcPr>
+          <w:p>
+            <w:pPr>
+              <w:spacing w:after="40" w:line="240" w:lineRule="auto"/>
+            </w:pPr>
+            <w:r/>
+            <w:r>
+              <w:rPr>
+                <w:rFonts w:ascii="Times New Roman" w:hAnsi="Times New Roman" w:cs="Times New Roman" w:eastAsia="Times New Roman"/>
+                <w:b w:val="0"/>
+                <w:i w:val="0"/>
+                <w:sz w:val="18"/>
+              </w:rPr>
+              <w:t>0.7189</w:t>
+            </w:r>
+          </w:p>
+        </w:tc>
+        <w:tc>
+          <w:tcPr>
+            <w:tcW w:type="dxa" w:w="2088"/>
+          </w:tcPr>
+          <w:p>
+            <w:pPr>
+              <w:spacing w:after="40" w:line="240" w:lineRule="auto"/>
+            </w:pPr>
+            <w:r/>
+            <w:r>
+              <w:rPr>
+                <w:rFonts w:ascii="Times New Roman" w:hAnsi="Times New Roman" w:cs="Times New Roman" w:eastAsia="Times New Roman"/>
+                <w:b w:val="0"/>
+                <w:i w:val="0"/>
+                <w:sz w:val="18"/>
+              </w:rPr>
+              <w:t>0.1104</w:t>
+            </w:r>
+          </w:p>
+        </w:tc>
+      </w:tr>
+      <w:tr>
+        <w:tc>
+          <w:tcPr>
+            <w:tcW w:type="dxa" w:w="3312"/>
+          </w:tcPr>
+          <w:p>
+            <w:pPr>
+              <w:spacing w:after="40" w:line="240" w:lineRule="auto"/>
+            </w:pPr>
+            <w:r/>
+            <w:r>
+              <w:rPr>
+                <w:rFonts w:ascii="Times New Roman" w:hAnsi="Times New Roman" w:cs="Times New Roman" w:eastAsia="Times New Roman"/>
+                <w:b w:val="0"/>
+                <w:i w:val="0"/>
+                <w:sz w:val="18"/>
+              </w:rPr>
               <w:t>With leakage (Risk_Score + Response_Time)</w:t>
             </w:r>
           </w:p>
         </w:tc>
         <w:tc>
           <w:tcPr>
-            <w:tcW w:type="dxa" w:w="2016"/>
-          </w:tcPr>
-          <w:p>
-            <w:pPr>
-              <w:spacing w:after="40" w:line="240" w:lineRule="auto"/>
-            </w:pPr>
-            <w:r/>
-            <w:r>
-              <w:rPr>
-                <w:rFonts w:ascii="Times New Roman" w:hAnsi="Times New Roman" w:cs="Times New Roman" w:eastAsia="Times New Roman"/>
-                <w:b w:val="0"/>
-                <w:i w:val="0"/>
-                <w:sz w:val="19"/>
+            <w:tcW w:type="dxa" w:w="1512"/>
+          </w:tcPr>
+          <w:p>
+            <w:pPr>
+              <w:spacing w:after="40" w:line="240" w:lineRule="auto"/>
+            </w:pPr>
+            <w:r/>
+            <w:r>
+              <w:rPr>
+                <w:rFonts w:ascii="Times New Roman" w:hAnsi="Times New Roman" w:cs="Times New Roman" w:eastAsia="Times New Roman"/>
+                <w:b w:val="0"/>
+                <w:i w:val="0"/>
+                <w:sz w:val="18"/>
               </w:rPr>
               <w:t>67</w:t>
             </w:r>
@@ -9330,19 +10148,19 @@
         </w:tc>
         <w:tc>
           <w:tcPr>
-            <w:tcW w:type="dxa" w:w="1440"/>
-          </w:tcPr>
-          <w:p>
-            <w:pPr>
-              <w:spacing w:after="40" w:line="240" w:lineRule="auto"/>
-            </w:pPr>
-            <w:r/>
-            <w:r>
-              <w:rPr>
-                <w:rFonts w:ascii="Times New Roman" w:hAnsi="Times New Roman" w:cs="Times New Roman" w:eastAsia="Times New Roman"/>
-                <w:b w:val="0"/>
-                <w:i w:val="0"/>
-                <w:sz w:val="19"/>
+            <w:tcW w:type="dxa" w:w="1224"/>
+          </w:tcPr>
+          <w:p>
+            <w:pPr>
+              <w:spacing w:after="40" w:line="240" w:lineRule="auto"/>
+            </w:pPr>
+            <w:r/>
+            <w:r>
+              <w:rPr>
+                <w:rFonts w:ascii="Times New Roman" w:hAnsi="Times New Roman" w:cs="Times New Roman" w:eastAsia="Times New Roman"/>
+                <w:b w:val="0"/>
+                <w:i w:val="0"/>
+                <w:sz w:val="18"/>
               </w:rPr>
               <w:t>0.9865</w:t>
             </w:r>
@@ -9350,21 +10168,41 @@
         </w:tc>
         <w:tc>
           <w:tcPr>
-            <w:tcW w:type="dxa" w:w="1440"/>
-          </w:tcPr>
-          <w:p>
-            <w:pPr>
-              <w:spacing w:after="40" w:line="240" w:lineRule="auto"/>
-            </w:pPr>
-            <w:r/>
-            <w:r>
-              <w:rPr>
-                <w:rFonts w:ascii="Times New Roman" w:hAnsi="Times New Roman" w:cs="Times New Roman" w:eastAsia="Times New Roman"/>
-                <w:b w:val="0"/>
-                <w:i w:val="0"/>
-                <w:sz w:val="19"/>
+            <w:tcW w:type="dxa" w:w="1224"/>
+          </w:tcPr>
+          <w:p>
+            <w:pPr>
+              <w:spacing w:after="40" w:line="240" w:lineRule="auto"/>
+            </w:pPr>
+            <w:r/>
+            <w:r>
+              <w:rPr>
+                <w:rFonts w:ascii="Times New Roman" w:hAnsi="Times New Roman" w:cs="Times New Roman" w:eastAsia="Times New Roman"/>
+                <w:b w:val="0"/>
+                <w:i w:val="0"/>
+                <w:sz w:val="18"/>
               </w:rPr>
               <w:t>0.9843</w:t>
+            </w:r>
+          </w:p>
+        </w:tc>
+        <w:tc>
+          <w:tcPr>
+            <w:tcW w:type="dxa" w:w="2088"/>
+          </w:tcPr>
+          <w:p>
+            <w:pPr>
+              <w:spacing w:after="40" w:line="240" w:lineRule="auto"/>
+            </w:pPr>
+            <w:r/>
+            <w:r>
+              <w:rPr>
+                <w:rFonts w:ascii="Times New Roman" w:hAnsi="Times New Roman" w:cs="Times New Roman" w:eastAsia="Times New Roman"/>
+                <w:b w:val="0"/>
+                <w:i w:val="0"/>
+                <w:sz w:val="18"/>
+              </w:rPr>
+              <w:t>0.0205</w:t>
             </w:r>
           </w:p>
         </w:tc>
@@ -9384,7 +10222,7 @@
       <w:r>
         <w:drawing>
           <wp:inline xmlns:a="http://schemas.openxmlformats.org/drawingml/2006/main" xmlns:pic="http://schemas.openxmlformats.org/drawingml/2006/picture">
-            <wp:extent cx="5394960" cy="2701145"/>
+            <wp:extent cx="5760720" cy="1829321"/>
             <wp:docPr id="10" name="Picture 10"/>
             <wp:cNvGraphicFramePr>
               <a:graphicFrameLocks noChangeAspect="1"/>
@@ -9405,7 +10243,7 @@
                   <pic:spPr>
                     <a:xfrm>
                       <a:off x="0" y="0"/>
-                      <a:ext cx="5394960" cy="2701145"/>
+                      <a:ext cx="5760720" cy="1829321"/>
                     </a:xfrm>
                     <a:prstGeom prst="rect"/>
                   </pic:spPr>
@@ -9452,7 +10290,7 @@
           <w:i w:val="0"/>
           <w:sz w:val="20"/>
         </w:rPr>
-        <w:t>. Feature-subset ablation study: accuracy and macro F1 for each subset. The Top-20 subset matches or beats the full feature set, and the leakage subset scores implausibly highly.</w:t>
+        <w:t>. Feature-subset ablation study: (a) accuracy and macro F1 for each subset under the fixed random forest and (b) the silhouette score obtained by re-running k-means on each subset. The Top-20 subset matches or beats the full feature set, and the leakage subset scores implausibly highly.</w:t>
       </w:r>
     </w:p>
     <w:p>
@@ -9466,7 +10304,63 @@
           <w:i w:val="0"/>
           <w:sz w:val="22"/>
         </w:rPr>
-        <w:t>Three conclusions follow from the ablation study. First, the **Top-20 subset performs as well as, or better than, the full feature set** — removing the weak and noisy variables improves generalisation and reduces the number of inputs that must be collected. Second, even a seven-feature model retains most of the predictive power, which demonstrates that a small, well-chosen feature set is sufficient for this task. Third, and most importantly, the subset containing the two leaking variables achieves a macro-F1 of 0.984 — close to perfect. That single result is the clearest possible demonstration of why leakage must be detected before it is mistaken for model quality.</w:t>
+        <w:t>Four conclusions follow from the ablation study, and they are the direct answer to the brief's requirement that feature subsets be assessed on both models.</w:t>
+      </w:r>
+    </w:p>
+    <w:p>
+      <w:pPr>
+        <w:spacing w:lineRule="auto" w:line="360" w:after="120"/>
+      </w:pPr>
+      <w:r>
+        <w:rPr>
+          <w:rFonts w:ascii="Times New Roman" w:hAnsi="Times New Roman" w:cs="Times New Roman" w:eastAsia="Times New Roman"/>
+          <w:b w:val="0"/>
+          <w:i w:val="0"/>
+          <w:sz w:val="22"/>
+        </w:rPr>
+        <w:t>**First, the selected subsets beat the full feature set.** Using only 20 columns instead of 65 raises macro-F1 from 0.6412 to 0.7006, and the 10-column subset is the strongest configuration of all at 0.7189. Discarding the weak and noisy variables therefore improves generalisation while also reducing the number of inputs that must be collected and maintained in service.</w:t>
+      </w:r>
+    </w:p>
+    <w:p>
+      <w:pPr>
+        <w:spacing w:lineRule="auto" w:line="360" w:after="120"/>
+      </w:pPr>
+      <w:r>
+        <w:rPr>
+          <w:rFonts w:ascii="Times New Roman" w:hAnsi="Times New Roman" w:cs="Times New Roman" w:eastAsia="Times New Roman"/>
+          <w:b w:val="0"/>
+          <w:i w:val="0"/>
+          <w:sz w:val="22"/>
+        </w:rPr>
+        <w:t>**Second, feature selection helps the unsupervised model even more than the supervised one.** Clustering quality rises sharply as the uninformative variables are removed: the silhouette score is 0.0205 with all 53 numeric features, 0.0473 with 19 features and 0.1104 with only 9 — a more than five-fold improvement. This shows that the diffuse clustering reported in Section 6 is caused by uninformative inputs diluting a Euclidean distance, not by an absence of structure in the traffic conditions themselves.</w:t>
+      </w:r>
+    </w:p>
+    <w:p>
+      <w:pPr>
+        <w:spacing w:lineRule="auto" w:line="360" w:after="120"/>
+      </w:pPr>
+      <w:r>
+        <w:rPr>
+          <w:rFonts w:ascii="Times New Roman" w:hAnsi="Times New Roman" w:cs="Times New Roman" w:eastAsia="Times New Roman"/>
+          <w:b w:val="0"/>
+          <w:i w:val="0"/>
+          <w:sz w:val="22"/>
+        </w:rPr>
+        <w:t>**Third, the leakage subset is implausibly strong.** Adding `Risk_Score` and `Emergency_Response_Time` lifts macro-F1 to 0.9843 and accuracy to 0.9865 — close to perfect. That single result is the clearest possible demonstration of why leakage must be detected before it is mistaken for model quality; a pipeline that reported it would fail the moment it met a real incident.</w:t>
+      </w:r>
+    </w:p>
+    <w:p>
+      <w:pPr>
+        <w:spacing w:lineRule="auto" w:line="360" w:after="120"/>
+      </w:pPr>
+      <w:r>
+        <w:rPr>
+          <w:rFonts w:ascii="Times New Roman" w:hAnsi="Times New Roman" w:cs="Times New Roman" w:eastAsia="Times New Roman"/>
+          <w:b w:val="0"/>
+          <w:i w:val="0"/>
+          <w:sz w:val="22"/>
+        </w:rPr>
+        <w:t>**Fourth, the ranking is stable.** The same variables dominate under mutual information, Gini importance and permutation importance, and under both the full and reduced subsets, so the feature conclusions do not depend on the choice of method.</w:t>
       </w:r>
     </w:p>
     <w:p>
@@ -9505,7 +10399,7 @@
           <w:color w:val="000000"/>
           <w:sz w:val="24"/>
         </w:rPr>
-        <w:t>5.1 Model design and rationale</w:t>
+        <w:t>5.1 Data Preparation</w:t>
       </w:r>
     </w:p>
     <w:p>
@@ -9519,7 +10413,83 @@
           <w:i w:val="0"/>
           <w:sz w:val="22"/>
         </w:rPr>
-        <w:t>The supervised task is a four-class classification problem with a severely imbalanced target. Four algorithms were implemented — one more than the minimum of three required by the brief — chosen to represent genuinely different learning strategies so that the comparison is informative rather than redundant. Table 10 lists the algorithms and the reason each was selected.</w:t>
+        <w:t>Data preparation for the classification task follows the pipeline justified in Section 2. In summary: the 14 duplicate records and the 7 records with a missing severity label were removed; the small number of scattered missing feature values were imputed with the median (numeric) or the mode (categorical); six numeric columns stored as text were coerced to numeric; inconsistent categorical labels were stripped and normalised; physically impossible measurements were set to missing and then imputed; the single record with End_Time earlier than Start_Time was dropped; and the identifier and near-unique columns were removed. This leaves 49,992 usable records.</w:t>
+      </w:r>
+    </w:p>
+    <w:p>
+      <w:pPr>
+        <w:spacing w:lineRule="auto" w:line="360" w:after="120"/>
+      </w:pPr>
+      <w:r>
+        <w:rPr>
+          <w:rFonts w:ascii="Times New Roman" w:hAnsi="Times New Roman" w:cs="Times New Roman" w:eastAsia="Times New Roman"/>
+          <w:b w:val="0"/>
+          <w:i w:val="0"/>
+          <w:sz w:val="22"/>
+        </w:rPr>
+        <w:t>Two preparation decisions are specific to supervised learning. First, the data is split 80% / 20% using **stratified** sampling, so each severity class appears in the same proportion in training and test sets — essential when the rarest class is only ~1.6% of the data. Second, every preprocessing step (imputation, standardisation, one-hot encoding) is contained inside a scikit-learn `Pipeline` that is fitted on the training fold alone, so no statistic from the test set can leak into training.</w:t>
+      </w:r>
+    </w:p>
+    <w:p>
+      <w:pPr>
+        <w:pStyle w:val="Heading2"/>
+        <w:keepNext/>
+        <w:spacing w:before="200" w:after="120" w:lineRule="auto" w:line="360"/>
+      </w:pPr>
+      <w:r>
+        <w:rPr>
+          <w:rFonts w:ascii="Times New Roman" w:hAnsi="Times New Roman" w:cs="Times New Roman" w:eastAsia="Times New Roman"/>
+          <w:b/>
+          <w:i w:val="0"/>
+          <w:color w:val="000000"/>
+          <w:sz w:val="24"/>
+        </w:rPr>
+        <w:t>5.2 Feature Development</w:t>
+      </w:r>
+    </w:p>
+    <w:p>
+      <w:pPr>
+        <w:spacing w:lineRule="auto" w:line="360" w:after="120"/>
+      </w:pPr>
+      <w:r>
+        <w:rPr>
+          <w:rFonts w:ascii="Times New Roman" w:hAnsi="Times New Roman" w:cs="Times New Roman" w:eastAsia="Times New Roman"/>
+          <w:b w:val="0"/>
+          <w:i w:val="0"/>
+          <w:sz w:val="22"/>
+        </w:rPr>
+        <w:t>Feature development is described in full in Section 4. Five features were engineered — Speed_Ratio, Vehicle_Load, Night_Incident, Adverse_Weather and the profiling-only Incident_Duration_Min. The leakage audit removed Risk_Score, Emergency_Response_Time, Response_Team, End_Time and the duration feature; the redundancy check removed Dew_Point and Average_Speed; and the temporal attributes were retained in their derived form (Hour, Day, Month, Year, Weekday, Weekend, Peak_Hour, Season). The resulting supervised feature matrix contains 65 input columns — 53 numeric and 12 categorical, expanding to 161 columns after one-hot encoding. Table 10 quantifies how each of these choices affects performance.</w:t>
+      </w:r>
+    </w:p>
+    <w:p>
+      <w:pPr>
+        <w:pStyle w:val="Heading2"/>
+        <w:keepNext/>
+        <w:spacing w:before="200" w:after="120" w:lineRule="auto" w:line="360"/>
+      </w:pPr>
+      <w:r>
+        <w:rPr>
+          <w:rFonts w:ascii="Times New Roman" w:hAnsi="Times New Roman" w:cs="Times New Roman" w:eastAsia="Times New Roman"/>
+          <w:b/>
+          <w:i w:val="0"/>
+          <w:color w:val="000000"/>
+          <w:sz w:val="24"/>
+        </w:rPr>
+        <w:t>5.3 Model Design</w:t>
+      </w:r>
+    </w:p>
+    <w:p>
+      <w:pPr>
+        <w:spacing w:lineRule="auto" w:line="360" w:after="120"/>
+      </w:pPr>
+      <w:r>
+        <w:rPr>
+          <w:rFonts w:ascii="Times New Roman" w:hAnsi="Times New Roman" w:cs="Times New Roman" w:eastAsia="Times New Roman"/>
+          <w:b w:val="0"/>
+          <w:i w:val="0"/>
+          <w:sz w:val="22"/>
+        </w:rPr>
+        <w:t>The supervised task is a four-class classification problem with a severely imbalanced target. Four algorithms were implemented — one more than the minimum of three required by the brief — chosen to represent genuinely different learning strategies so that the comparison is informative rather than redundant. Table 11 lists the algorithms and the reason each was selected.</w:t>
       </w:r>
     </w:p>
     <w:p>
@@ -9548,7 +10518,7 @@
         <w:fldChar w:fldCharType="begin"/>
         <w:instrText xml:space="preserve"> SEQ Table \* ARABIC </w:instrText>
         <w:fldChar w:fldCharType="separate"/>
-        <w:t>10</w:t>
+        <w:t>11</w:t>
         <w:fldChar w:fldCharType="end"/>
       </w:r>
       <w:r>
@@ -9906,7 +10876,7 @@
           <w:color w:val="000000"/>
           <w:sz w:val="24"/>
         </w:rPr>
-        <w:t>5.2 Stratified split and evaluation protocol</w:t>
+        <w:t>5.4 Evaluation and Validation</w:t>
       </w:r>
     </w:p>
     <w:p>
@@ -9965,7 +10935,7 @@
           <w:color w:val="000000"/>
           <w:sz w:val="24"/>
         </w:rPr>
-        <w:t>5.3 Baseline comparison of the four classifiers</w:t>
+        <w:t>5.5 Baseline comparison of the four classifiers</w:t>
       </w:r>
     </w:p>
     <w:p>
@@ -9979,7 +10949,7 @@
           <w:i w:val="0"/>
           <w:sz w:val="22"/>
         </w:rPr>
-        <w:t>Table 11 reports the untuned performance of all four algorithms on the held-out test set, and Figure 11 shows their confusion matrices side by side.</w:t>
+        <w:t>Table 12 reports the untuned performance of all four algorithms on the held-out test set, and Figure 11 shows their confusion matrices side by side.</w:t>
       </w:r>
     </w:p>
     <w:p>
@@ -10008,7 +10978,7 @@
         <w:fldChar w:fldCharType="begin"/>
         <w:instrText xml:space="preserve"> SEQ Table \* ARABIC </w:instrText>
         <w:fldChar w:fldCharType="separate"/>
-        <w:t>11</w:t>
+        <w:t>12</w:t>
         <w:fldChar w:fldCharType="end"/>
       </w:r>
       <w:r>
@@ -10766,7 +11736,7 @@
           <w:color w:val="000000"/>
           <w:sz w:val="24"/>
         </w:rPr>
-        <w:t>5.4 Hyper-parameter tuning</w:t>
+        <w:t>5.6 Hyper-parameter tuning</w:t>
       </w:r>
     </w:p>
     <w:p>
@@ -10780,360 +11750,7 @@
           <w:i w:val="0"/>
           <w:sz w:val="22"/>
         </w:rPr>
-        <w:t>The three strongest models were tuned with grid search using three-fold stratified cross-validation and macro-F1 as the optimisation objective. Optimising macro-F1 rather than accuracy is a deliberate choice: it forces the search to value the rare Severity-1 class rather than the majority class. Table 12 shows the best cross-validated score and the selected hyper-parameters for each model.</w:t>
-      </w:r>
-    </w:p>
-    <w:p>
-      <w:pPr>
-        <w:pStyle w:val="Caption"/>
-        <w:keepNext/>
-        <w:spacing w:lineRule="auto" w:line="240" w:after="120" w:before="40"/>
-        <w:jc w:val="left"/>
-      </w:pPr>
-      <w:r>
-        <w:rPr>
-          <w:rFonts w:ascii="Times New Roman" w:hAnsi="Times New Roman" w:cs="Times New Roman" w:eastAsia="Times New Roman"/>
-          <w:b w:val="0"/>
-          <w:i w:val="0"/>
-          <w:sz w:val="20"/>
-        </w:rPr>
-        <w:t xml:space="preserve">Table </w:t>
-      </w:r>
-      <w:r>
-        <w:rPr>
-          <w:rFonts w:ascii="Times New Roman" w:hAnsi="Times New Roman" w:cs="Times New Roman" w:eastAsia="Times New Roman"/>
-          <w:b w:val="0"/>
-          <w:i w:val="0"/>
-          <w:sz w:val="20"/>
-        </w:rPr>
-        <w:fldChar w:fldCharType="begin"/>
-        <w:instrText xml:space="preserve"> SEQ Table \* ARABIC </w:instrText>
-        <w:fldChar w:fldCharType="separate"/>
-        <w:t>12</w:t>
-        <w:fldChar w:fldCharType="end"/>
-      </w:r>
-      <w:r>
-        <w:rPr>
-          <w:rFonts w:ascii="Times New Roman" w:hAnsi="Times New Roman" w:cs="Times New Roman" w:eastAsia="Times New Roman"/>
-          <w:b w:val="0"/>
-          <w:i w:val="0"/>
-          <w:sz w:val="20"/>
-        </w:rPr>
-        <w:t>. Hyper-parameter tuning results (3-fold stratified cross-validation, macro-F1 objective)</w:t>
-      </w:r>
-    </w:p>
-    <w:tbl>
-      <w:tblPr>
-        <w:tblStyle w:val="TableGrid"/>
-        <w:tblW w:type="auto" w:w="0"/>
-        <w:jc w:val="center"/>
-        <w:tblLook w:firstColumn="1" w:firstRow="1" w:lastColumn="0" w:lastRow="0" w:noHBand="0" w:noVBand="1" w:val="04A0"/>
-      </w:tblPr>
-      <w:tblGrid>
-        <w:gridCol w:w="3120"/>
-        <w:gridCol w:w="3120"/>
-        <w:gridCol w:w="3120"/>
-      </w:tblGrid>
-      <w:tr>
-        <w:tc>
-          <w:tcPr>
-            <w:tcW w:type="dxa" w:w="2304"/>
-            <w:shd w:val="clear" w:color="auto" w:fill="D9E2F3"/>
-          </w:tcPr>
-          <w:p>
-            <w:pPr>
-              <w:spacing w:after="40" w:line="240" w:lineRule="auto"/>
-            </w:pPr>
-            <w:r/>
-            <w:r>
-              <w:rPr>
-                <w:rFonts w:ascii="Times New Roman" w:hAnsi="Times New Roman" w:cs="Times New Roman" w:eastAsia="Times New Roman"/>
-                <w:b/>
-                <w:i w:val="0"/>
-                <w:sz w:val="19"/>
-              </w:rPr>
-              <w:t>Model</w:t>
-            </w:r>
-          </w:p>
-        </w:tc>
-        <w:tc>
-          <w:tcPr>
-            <w:tcW w:type="dxa" w:w="2736"/>
-            <w:shd w:val="clear" w:color="auto" w:fill="D9E2F3"/>
-          </w:tcPr>
-          <w:p>
-            <w:pPr>
-              <w:spacing w:after="40" w:line="240" w:lineRule="auto"/>
-            </w:pPr>
-            <w:r/>
-            <w:r>
-              <w:rPr>
-                <w:rFonts w:ascii="Times New Roman" w:hAnsi="Times New Roman" w:cs="Times New Roman" w:eastAsia="Times New Roman"/>
-                <w:b/>
-                <w:i w:val="0"/>
-                <w:sz w:val="19"/>
-              </w:rPr>
-              <w:t>Best cross-validated macro F1</w:t>
-            </w:r>
-          </w:p>
-        </w:tc>
-        <w:tc>
-          <w:tcPr>
-            <w:tcW w:type="dxa" w:w="3600"/>
-            <w:shd w:val="clear" w:color="auto" w:fill="D9E2F3"/>
-          </w:tcPr>
-          <w:p>
-            <w:pPr>
-              <w:spacing w:after="40" w:line="240" w:lineRule="auto"/>
-            </w:pPr>
-            <w:r/>
-            <w:r>
-              <w:rPr>
-                <w:rFonts w:ascii="Times New Roman" w:hAnsi="Times New Roman" w:cs="Times New Roman" w:eastAsia="Times New Roman"/>
-                <w:b/>
-                <w:i w:val="0"/>
-                <w:sz w:val="19"/>
-              </w:rPr>
-              <w:t>Selected hyper-parameters</w:t>
-            </w:r>
-          </w:p>
-        </w:tc>
-      </w:tr>
-      <w:tr>
-        <w:tc>
-          <w:tcPr>
-            <w:tcW w:type="dxa" w:w="2304"/>
-          </w:tcPr>
-          <w:p>
-            <w:pPr>
-              <w:spacing w:after="40" w:line="240" w:lineRule="auto"/>
-            </w:pPr>
-            <w:r/>
-            <w:r>
-              <w:rPr>
-                <w:rFonts w:ascii="Times New Roman" w:hAnsi="Times New Roman" w:cs="Times New Roman" w:eastAsia="Times New Roman"/>
-                <w:b w:val="0"/>
-                <w:i w:val="0"/>
-                <w:sz w:val="19"/>
-              </w:rPr>
-              <w:t>Logistic Regression</w:t>
-            </w:r>
-          </w:p>
-        </w:tc>
-        <w:tc>
-          <w:tcPr>
-            <w:tcW w:type="dxa" w:w="2736"/>
-          </w:tcPr>
-          <w:p>
-            <w:pPr>
-              <w:spacing w:after="40" w:line="240" w:lineRule="auto"/>
-            </w:pPr>
-            <w:r/>
-            <w:r>
-              <w:rPr>
-                <w:rFonts w:ascii="Times New Roman" w:hAnsi="Times New Roman" w:cs="Times New Roman" w:eastAsia="Times New Roman"/>
-                <w:b w:val="0"/>
-                <w:i w:val="0"/>
-                <w:sz w:val="19"/>
-              </w:rPr>
-              <w:t>0.7362</w:t>
-            </w:r>
-          </w:p>
-        </w:tc>
-        <w:tc>
-          <w:tcPr>
-            <w:tcW w:type="dxa" w:w="3600"/>
-          </w:tcPr>
-          <w:p>
-            <w:pPr>
-              <w:spacing w:after="40" w:line="240" w:lineRule="auto"/>
-            </w:pPr>
-            <w:r/>
-            <w:r>
-              <w:rPr>
-                <w:rFonts w:ascii="Times New Roman" w:hAnsi="Times New Roman" w:cs="Times New Roman" w:eastAsia="Times New Roman"/>
-                <w:b w:val="0"/>
-                <w:i w:val="0"/>
-                <w:sz w:val="19"/>
-              </w:rPr>
-              <w:t>C=0.1, solver=lbfgs</w:t>
-            </w:r>
-          </w:p>
-        </w:tc>
-      </w:tr>
-      <w:tr>
-        <w:tc>
-          <w:tcPr>
-            <w:tcW w:type="dxa" w:w="2304"/>
-          </w:tcPr>
-          <w:p>
-            <w:pPr>
-              <w:spacing w:after="40" w:line="240" w:lineRule="auto"/>
-            </w:pPr>
-            <w:r/>
-            <w:r>
-              <w:rPr>
-                <w:rFonts w:ascii="Times New Roman" w:hAnsi="Times New Roman" w:cs="Times New Roman" w:eastAsia="Times New Roman"/>
-                <w:b w:val="0"/>
-                <w:i w:val="0"/>
-                <w:sz w:val="19"/>
-              </w:rPr>
-              <w:t>Random Forest</w:t>
-            </w:r>
-          </w:p>
-        </w:tc>
-        <w:tc>
-          <w:tcPr>
-            <w:tcW w:type="dxa" w:w="2736"/>
-          </w:tcPr>
-          <w:p>
-            <w:pPr>
-              <w:spacing w:after="40" w:line="240" w:lineRule="auto"/>
-            </w:pPr>
-            <w:r/>
-            <w:r>
-              <w:rPr>
-                <w:rFonts w:ascii="Times New Roman" w:hAnsi="Times New Roman" w:cs="Times New Roman" w:eastAsia="Times New Roman"/>
-                <w:b w:val="0"/>
-                <w:i w:val="0"/>
-                <w:sz w:val="19"/>
-              </w:rPr>
-              <w:t>0.7092</w:t>
-            </w:r>
-          </w:p>
-        </w:tc>
-        <w:tc>
-          <w:tcPr>
-            <w:tcW w:type="dxa" w:w="3600"/>
-          </w:tcPr>
-          <w:p>
-            <w:pPr>
-              <w:spacing w:after="40" w:line="240" w:lineRule="auto"/>
-            </w:pPr>
-            <w:r/>
-            <w:r>
-              <w:rPr>
-                <w:rFonts w:ascii="Times New Roman" w:hAnsi="Times New Roman" w:cs="Times New Roman" w:eastAsia="Times New Roman"/>
-                <w:b w:val="0"/>
-                <w:i w:val="0"/>
-                <w:sz w:val="19"/>
-              </w:rPr>
-              <w:t>max_depth=None, min_samples_leaf=5, n_estimators=300</w:t>
-            </w:r>
-          </w:p>
-        </w:tc>
-      </w:tr>
-      <w:tr>
-        <w:tc>
-          <w:tcPr>
-            <w:tcW w:type="dxa" w:w="2304"/>
-          </w:tcPr>
-          <w:p>
-            <w:pPr>
-              <w:spacing w:after="40" w:line="240" w:lineRule="auto"/>
-            </w:pPr>
-            <w:r/>
-            <w:r>
-              <w:rPr>
-                <w:rFonts w:ascii="Times New Roman" w:hAnsi="Times New Roman" w:cs="Times New Roman" w:eastAsia="Times New Roman"/>
-                <w:b w:val="0"/>
-                <w:i w:val="0"/>
-                <w:sz w:val="19"/>
-              </w:rPr>
-              <w:t>Hist Gradient Boosting</w:t>
-            </w:r>
-          </w:p>
-        </w:tc>
-        <w:tc>
-          <w:tcPr>
-            <w:tcW w:type="dxa" w:w="2736"/>
-          </w:tcPr>
-          <w:p>
-            <w:pPr>
-              <w:spacing w:after="40" w:line="240" w:lineRule="auto"/>
-            </w:pPr>
-            <w:r/>
-            <w:r>
-              <w:rPr>
-                <w:rFonts w:ascii="Times New Roman" w:hAnsi="Times New Roman" w:cs="Times New Roman" w:eastAsia="Times New Roman"/>
-                <w:b w:val="0"/>
-                <w:i w:val="0"/>
-                <w:sz w:val="19"/>
-              </w:rPr>
-              <w:t>0.7353</w:t>
-            </w:r>
-          </w:p>
-        </w:tc>
-        <w:tc>
-          <w:tcPr>
-            <w:tcW w:type="dxa" w:w="3600"/>
-          </w:tcPr>
-          <w:p>
-            <w:pPr>
-              <w:spacing w:after="40" w:line="240" w:lineRule="auto"/>
-            </w:pPr>
-            <w:r/>
-            <w:r>
-              <w:rPr>
-                <w:rFonts w:ascii="Times New Roman" w:hAnsi="Times New Roman" w:cs="Times New Roman" w:eastAsia="Times New Roman"/>
-                <w:b w:val="0"/>
-                <w:i w:val="0"/>
-                <w:sz w:val="19"/>
-              </w:rPr>
-              <w:t>learning_rate=0.1, max_iter=200, max_leaf_nodes=31</w:t>
-            </w:r>
-          </w:p>
-        </w:tc>
-      </w:tr>
-    </w:tbl>
-    <w:p>
-      <w:pPr>
-        <w:spacing w:lineRule="auto" w:line="240" w:after="80"/>
-      </w:pPr>
-    </w:p>
-    <w:p>
-      <w:pPr>
-        <w:spacing w:lineRule="auto" w:line="360" w:after="120"/>
-      </w:pPr>
-      <w:r>
-        <w:rPr>
-          <w:rFonts w:ascii="Times New Roman" w:hAnsi="Times New Roman" w:cs="Times New Roman" w:eastAsia="Times New Roman"/>
-          <w:b w:val="0"/>
-          <w:i w:val="0"/>
-          <w:sz w:val="22"/>
-        </w:rPr>
-        <w:t>Logistic regression and gradient boosting remain the strongest models after tuning, and the tuning gains are small — evidence that the models were already close to their ceiling on this dataset rather than evidence that tuning was unnecessary. The low regularisation strength selected for logistic regression (C = 0.1) indicates that the model benefits from being kept simple, which is consistent with the weak and largely linear signal present in the data.</w:t>
-      </w:r>
-    </w:p>
-    <w:p>
-      <w:pPr>
-        <w:pStyle w:val="Heading2"/>
-        <w:keepNext/>
-        <w:spacing w:before="200" w:after="120" w:lineRule="auto" w:line="360"/>
-      </w:pPr>
-      <w:r>
-        <w:rPr>
-          <w:rFonts w:ascii="Times New Roman" w:hAnsi="Times New Roman" w:cs="Times New Roman" w:eastAsia="Times New Roman"/>
-          <w:b/>
-          <w:i w:val="0"/>
-          <w:color w:val="000000"/>
-          <w:sz w:val="24"/>
-        </w:rPr>
-        <w:t>5.5 Handling the class imbalance</w:t>
-      </w:r>
-    </w:p>
-    <w:p>
-      <w:pPr>
-        <w:spacing w:lineRule="auto" w:line="360" w:after="120"/>
-      </w:pPr>
-      <w:r>
-        <w:rPr>
-          <w:rFonts w:ascii="Times New Roman" w:hAnsi="Times New Roman" w:cs="Times New Roman" w:eastAsia="Times New Roman"/>
-          <w:b w:val="0"/>
-          <w:i w:val="0"/>
-          <w:sz w:val="22"/>
-        </w:rPr>
-        <w:t>Because the brief requires the imbalance to be addressed explicitly and the effect demonstrated, three strategies were compared on an identical model and split: no balancing, balanced class weights, and random over-sampling of the minority classes. Table 13 reports the outcome, including the recall of the rare Severity-1 class, which is the metric most affected.</w:t>
+        <w:t>The three strongest models were tuned with grid search using three-fold stratified cross-validation and macro-F1 as the optimisation objective. Optimising macro-F1 rather than accuracy is a deliberate choice: it forces the search to value the rare Severity-1 class rather than the majority class. Table 13 shows the best cross-validated score and the selected hyper-parameters for each model.</w:t>
       </w:r>
     </w:p>
     <w:p>
@@ -11172,6 +11789,359 @@
           <w:i w:val="0"/>
           <w:sz w:val="20"/>
         </w:rPr>
+        <w:t>. Hyper-parameter tuning results (3-fold stratified cross-validation, macro-F1 objective)</w:t>
+      </w:r>
+    </w:p>
+    <w:tbl>
+      <w:tblPr>
+        <w:tblStyle w:val="TableGrid"/>
+        <w:tblW w:type="auto" w:w="0"/>
+        <w:jc w:val="center"/>
+        <w:tblLook w:firstColumn="1" w:firstRow="1" w:lastColumn="0" w:lastRow="0" w:noHBand="0" w:noVBand="1" w:val="04A0"/>
+      </w:tblPr>
+      <w:tblGrid>
+        <w:gridCol w:w="3120"/>
+        <w:gridCol w:w="3120"/>
+        <w:gridCol w:w="3120"/>
+      </w:tblGrid>
+      <w:tr>
+        <w:tc>
+          <w:tcPr>
+            <w:tcW w:type="dxa" w:w="2304"/>
+            <w:shd w:val="clear" w:color="auto" w:fill="D9E2F3"/>
+          </w:tcPr>
+          <w:p>
+            <w:pPr>
+              <w:spacing w:after="40" w:line="240" w:lineRule="auto"/>
+            </w:pPr>
+            <w:r/>
+            <w:r>
+              <w:rPr>
+                <w:rFonts w:ascii="Times New Roman" w:hAnsi="Times New Roman" w:cs="Times New Roman" w:eastAsia="Times New Roman"/>
+                <w:b/>
+                <w:i w:val="0"/>
+                <w:sz w:val="19"/>
+              </w:rPr>
+              <w:t>Model</w:t>
+            </w:r>
+          </w:p>
+        </w:tc>
+        <w:tc>
+          <w:tcPr>
+            <w:tcW w:type="dxa" w:w="2736"/>
+            <w:shd w:val="clear" w:color="auto" w:fill="D9E2F3"/>
+          </w:tcPr>
+          <w:p>
+            <w:pPr>
+              <w:spacing w:after="40" w:line="240" w:lineRule="auto"/>
+            </w:pPr>
+            <w:r/>
+            <w:r>
+              <w:rPr>
+                <w:rFonts w:ascii="Times New Roman" w:hAnsi="Times New Roman" w:cs="Times New Roman" w:eastAsia="Times New Roman"/>
+                <w:b/>
+                <w:i w:val="0"/>
+                <w:sz w:val="19"/>
+              </w:rPr>
+              <w:t>Best cross-validated macro F1</w:t>
+            </w:r>
+          </w:p>
+        </w:tc>
+        <w:tc>
+          <w:tcPr>
+            <w:tcW w:type="dxa" w:w="3600"/>
+            <w:shd w:val="clear" w:color="auto" w:fill="D9E2F3"/>
+          </w:tcPr>
+          <w:p>
+            <w:pPr>
+              <w:spacing w:after="40" w:line="240" w:lineRule="auto"/>
+            </w:pPr>
+            <w:r/>
+            <w:r>
+              <w:rPr>
+                <w:rFonts w:ascii="Times New Roman" w:hAnsi="Times New Roman" w:cs="Times New Roman" w:eastAsia="Times New Roman"/>
+                <w:b/>
+                <w:i w:val="0"/>
+                <w:sz w:val="19"/>
+              </w:rPr>
+              <w:t>Selected hyper-parameters</w:t>
+            </w:r>
+          </w:p>
+        </w:tc>
+      </w:tr>
+      <w:tr>
+        <w:tc>
+          <w:tcPr>
+            <w:tcW w:type="dxa" w:w="2304"/>
+          </w:tcPr>
+          <w:p>
+            <w:pPr>
+              <w:spacing w:after="40" w:line="240" w:lineRule="auto"/>
+            </w:pPr>
+            <w:r/>
+            <w:r>
+              <w:rPr>
+                <w:rFonts w:ascii="Times New Roman" w:hAnsi="Times New Roman" w:cs="Times New Roman" w:eastAsia="Times New Roman"/>
+                <w:b w:val="0"/>
+                <w:i w:val="0"/>
+                <w:sz w:val="19"/>
+              </w:rPr>
+              <w:t>Logistic Regression</w:t>
+            </w:r>
+          </w:p>
+        </w:tc>
+        <w:tc>
+          <w:tcPr>
+            <w:tcW w:type="dxa" w:w="2736"/>
+          </w:tcPr>
+          <w:p>
+            <w:pPr>
+              <w:spacing w:after="40" w:line="240" w:lineRule="auto"/>
+            </w:pPr>
+            <w:r/>
+            <w:r>
+              <w:rPr>
+                <w:rFonts w:ascii="Times New Roman" w:hAnsi="Times New Roman" w:cs="Times New Roman" w:eastAsia="Times New Roman"/>
+                <w:b w:val="0"/>
+                <w:i w:val="0"/>
+                <w:sz w:val="19"/>
+              </w:rPr>
+              <w:t>0.7362</w:t>
+            </w:r>
+          </w:p>
+        </w:tc>
+        <w:tc>
+          <w:tcPr>
+            <w:tcW w:type="dxa" w:w="3600"/>
+          </w:tcPr>
+          <w:p>
+            <w:pPr>
+              <w:spacing w:after="40" w:line="240" w:lineRule="auto"/>
+            </w:pPr>
+            <w:r/>
+            <w:r>
+              <w:rPr>
+                <w:rFonts w:ascii="Times New Roman" w:hAnsi="Times New Roman" w:cs="Times New Roman" w:eastAsia="Times New Roman"/>
+                <w:b w:val="0"/>
+                <w:i w:val="0"/>
+                <w:sz w:val="19"/>
+              </w:rPr>
+              <w:t>C=0.1, solver=lbfgs</w:t>
+            </w:r>
+          </w:p>
+        </w:tc>
+      </w:tr>
+      <w:tr>
+        <w:tc>
+          <w:tcPr>
+            <w:tcW w:type="dxa" w:w="2304"/>
+          </w:tcPr>
+          <w:p>
+            <w:pPr>
+              <w:spacing w:after="40" w:line="240" w:lineRule="auto"/>
+            </w:pPr>
+            <w:r/>
+            <w:r>
+              <w:rPr>
+                <w:rFonts w:ascii="Times New Roman" w:hAnsi="Times New Roman" w:cs="Times New Roman" w:eastAsia="Times New Roman"/>
+                <w:b w:val="0"/>
+                <w:i w:val="0"/>
+                <w:sz w:val="19"/>
+              </w:rPr>
+              <w:t>Random Forest</w:t>
+            </w:r>
+          </w:p>
+        </w:tc>
+        <w:tc>
+          <w:tcPr>
+            <w:tcW w:type="dxa" w:w="2736"/>
+          </w:tcPr>
+          <w:p>
+            <w:pPr>
+              <w:spacing w:after="40" w:line="240" w:lineRule="auto"/>
+            </w:pPr>
+            <w:r/>
+            <w:r>
+              <w:rPr>
+                <w:rFonts w:ascii="Times New Roman" w:hAnsi="Times New Roman" w:cs="Times New Roman" w:eastAsia="Times New Roman"/>
+                <w:b w:val="0"/>
+                <w:i w:val="0"/>
+                <w:sz w:val="19"/>
+              </w:rPr>
+              <w:t>0.7092</w:t>
+            </w:r>
+          </w:p>
+        </w:tc>
+        <w:tc>
+          <w:tcPr>
+            <w:tcW w:type="dxa" w:w="3600"/>
+          </w:tcPr>
+          <w:p>
+            <w:pPr>
+              <w:spacing w:after="40" w:line="240" w:lineRule="auto"/>
+            </w:pPr>
+            <w:r/>
+            <w:r>
+              <w:rPr>
+                <w:rFonts w:ascii="Times New Roman" w:hAnsi="Times New Roman" w:cs="Times New Roman" w:eastAsia="Times New Roman"/>
+                <w:b w:val="0"/>
+                <w:i w:val="0"/>
+                <w:sz w:val="19"/>
+              </w:rPr>
+              <w:t>max_depth=None, min_samples_leaf=5, n_estimators=300</w:t>
+            </w:r>
+          </w:p>
+        </w:tc>
+      </w:tr>
+      <w:tr>
+        <w:tc>
+          <w:tcPr>
+            <w:tcW w:type="dxa" w:w="2304"/>
+          </w:tcPr>
+          <w:p>
+            <w:pPr>
+              <w:spacing w:after="40" w:line="240" w:lineRule="auto"/>
+            </w:pPr>
+            <w:r/>
+            <w:r>
+              <w:rPr>
+                <w:rFonts w:ascii="Times New Roman" w:hAnsi="Times New Roman" w:cs="Times New Roman" w:eastAsia="Times New Roman"/>
+                <w:b w:val="0"/>
+                <w:i w:val="0"/>
+                <w:sz w:val="19"/>
+              </w:rPr>
+              <w:t>Hist Gradient Boosting</w:t>
+            </w:r>
+          </w:p>
+        </w:tc>
+        <w:tc>
+          <w:tcPr>
+            <w:tcW w:type="dxa" w:w="2736"/>
+          </w:tcPr>
+          <w:p>
+            <w:pPr>
+              <w:spacing w:after="40" w:line="240" w:lineRule="auto"/>
+            </w:pPr>
+            <w:r/>
+            <w:r>
+              <w:rPr>
+                <w:rFonts w:ascii="Times New Roman" w:hAnsi="Times New Roman" w:cs="Times New Roman" w:eastAsia="Times New Roman"/>
+                <w:b w:val="0"/>
+                <w:i w:val="0"/>
+                <w:sz w:val="19"/>
+              </w:rPr>
+              <w:t>0.7353</w:t>
+            </w:r>
+          </w:p>
+        </w:tc>
+        <w:tc>
+          <w:tcPr>
+            <w:tcW w:type="dxa" w:w="3600"/>
+          </w:tcPr>
+          <w:p>
+            <w:pPr>
+              <w:spacing w:after="40" w:line="240" w:lineRule="auto"/>
+            </w:pPr>
+            <w:r/>
+            <w:r>
+              <w:rPr>
+                <w:rFonts w:ascii="Times New Roman" w:hAnsi="Times New Roman" w:cs="Times New Roman" w:eastAsia="Times New Roman"/>
+                <w:b w:val="0"/>
+                <w:i w:val="0"/>
+                <w:sz w:val="19"/>
+              </w:rPr>
+              <w:t>learning_rate=0.1, max_iter=200, max_leaf_nodes=31</w:t>
+            </w:r>
+          </w:p>
+        </w:tc>
+      </w:tr>
+    </w:tbl>
+    <w:p>
+      <w:pPr>
+        <w:spacing w:lineRule="auto" w:line="240" w:after="80"/>
+      </w:pPr>
+    </w:p>
+    <w:p>
+      <w:pPr>
+        <w:spacing w:lineRule="auto" w:line="360" w:after="120"/>
+      </w:pPr>
+      <w:r>
+        <w:rPr>
+          <w:rFonts w:ascii="Times New Roman" w:hAnsi="Times New Roman" w:cs="Times New Roman" w:eastAsia="Times New Roman"/>
+          <w:b w:val="0"/>
+          <w:i w:val="0"/>
+          <w:sz w:val="22"/>
+        </w:rPr>
+        <w:t>Logistic regression and gradient boosting remain the strongest models after tuning, and the tuning gains are small — evidence that the models were already close to their ceiling on this dataset rather than evidence that tuning was unnecessary. The low regularisation strength selected for logistic regression (C = 0.1) indicates that the model benefits from being kept simple, which is consistent with the weak and largely linear signal present in the data.</w:t>
+      </w:r>
+    </w:p>
+    <w:p>
+      <w:pPr>
+        <w:pStyle w:val="Heading2"/>
+        <w:keepNext/>
+        <w:spacing w:before="200" w:after="120" w:lineRule="auto" w:line="360"/>
+      </w:pPr>
+      <w:r>
+        <w:rPr>
+          <w:rFonts w:ascii="Times New Roman" w:hAnsi="Times New Roman" w:cs="Times New Roman" w:eastAsia="Times New Roman"/>
+          <w:b/>
+          <w:i w:val="0"/>
+          <w:color w:val="000000"/>
+          <w:sz w:val="24"/>
+        </w:rPr>
+        <w:t>5.7 Handling the class imbalance</w:t>
+      </w:r>
+    </w:p>
+    <w:p>
+      <w:pPr>
+        <w:spacing w:lineRule="auto" w:line="360" w:after="120"/>
+      </w:pPr>
+      <w:r>
+        <w:rPr>
+          <w:rFonts w:ascii="Times New Roman" w:hAnsi="Times New Roman" w:cs="Times New Roman" w:eastAsia="Times New Roman"/>
+          <w:b w:val="0"/>
+          <w:i w:val="0"/>
+          <w:sz w:val="22"/>
+        </w:rPr>
+        <w:t>Because the brief requires the imbalance to be addressed explicitly and the effect demonstrated, three strategies were compared on an identical model and split: no balancing, balanced class weights, and random over-sampling of the minority classes. Table 14 reports the outcome, including the recall of the rare Severity-1 class, which is the metric most affected.</w:t>
+      </w:r>
+    </w:p>
+    <w:p>
+      <w:pPr>
+        <w:pStyle w:val="Caption"/>
+        <w:keepNext/>
+        <w:spacing w:lineRule="auto" w:line="240" w:after="120" w:before="40"/>
+        <w:jc w:val="left"/>
+      </w:pPr>
+      <w:r>
+        <w:rPr>
+          <w:rFonts w:ascii="Times New Roman" w:hAnsi="Times New Roman" w:cs="Times New Roman" w:eastAsia="Times New Roman"/>
+          <w:b w:val="0"/>
+          <w:i w:val="0"/>
+          <w:sz w:val="20"/>
+        </w:rPr>
+        <w:t xml:space="preserve">Table </w:t>
+      </w:r>
+      <w:r>
+        <w:rPr>
+          <w:rFonts w:ascii="Times New Roman" w:hAnsi="Times New Roman" w:cs="Times New Roman" w:eastAsia="Times New Roman"/>
+          <w:b w:val="0"/>
+          <w:i w:val="0"/>
+          <w:sz w:val="20"/>
+        </w:rPr>
+        <w:fldChar w:fldCharType="begin"/>
+        <w:instrText xml:space="preserve"> SEQ Table \* ARABIC </w:instrText>
+        <w:fldChar w:fldCharType="separate"/>
+        <w:t>14</w:t>
+        <w:fldChar w:fldCharType="end"/>
+      </w:r>
+      <w:r>
+        <w:rPr>
+          <w:rFonts w:ascii="Times New Roman" w:hAnsi="Times New Roman" w:cs="Times New Roman" w:eastAsia="Times New Roman"/>
+          <w:b w:val="0"/>
+          <w:i w:val="0"/>
+          <w:sz w:val="20"/>
+        </w:rPr>
         <w:t>. Effect of class-imbalance handling (logistic regression, identical split)</w:t>
       </w:r>
     </w:p>
@@ -11554,7 +12524,7 @@
           <w:color w:val="000000"/>
           <w:sz w:val="24"/>
         </w:rPr>
-        <w:t>5.6 Final comparison of the tuned models</w:t>
+        <w:t>5.8 Final comparison of the tuned models</w:t>
       </w:r>
     </w:p>
     <w:p>
@@ -11568,7 +12538,7 @@
           <w:i w:val="0"/>
           <w:sz w:val="22"/>
         </w:rPr>
-        <w:t>Table 14 and Figure 12 present the final, tuned comparison. The best model by macro-F1 is **Logistic Regression**.</w:t>
+        <w:t>Table 15 and Figure 12 present the final, tuned comparison. The best model by macro-F1 is **Logistic Regression**.</w:t>
       </w:r>
     </w:p>
     <w:p>
@@ -11597,7 +12567,7 @@
         <w:fldChar w:fldCharType="begin"/>
         <w:instrText xml:space="preserve"> SEQ Table \* ARABIC </w:instrText>
         <w:fldChar w:fldCharType="separate"/>
-        <w:t>14</w:t>
+        <w:t>15</w:t>
         <w:fldChar w:fldCharType="end"/>
       </w:r>
       <w:r>
@@ -12219,7 +13189,7 @@
           <w:color w:val="000000"/>
           <w:sz w:val="24"/>
         </w:rPr>
-        <w:t>5.7 Class-level error analysis</w:t>
+        <w:t>5.9 Class-level error analysis</w:t>
       </w:r>
     </w:p>
     <w:p>
@@ -12233,7 +13203,7 @@
           <w:i w:val="0"/>
           <w:sz w:val="22"/>
         </w:rPr>
-        <w:t>Aggregate metrics hide which classes the model actually gets right. Table 15 breaks the best model's performance down by severity level, and Figure 13 shows the normalised confusion matrix.</w:t>
+        <w:t>Aggregate metrics hide which classes the model actually gets right. Table 16 breaks the best model's performance down by severity level, and Figure 13 shows the normalised confusion matrix.</w:t>
       </w:r>
     </w:p>
     <w:p>
@@ -12262,7 +13232,7 @@
         <w:fldChar w:fldCharType="begin"/>
         <w:instrText xml:space="preserve"> SEQ Table \* ARABIC </w:instrText>
         <w:fldChar w:fldCharType="separate"/>
-        <w:t>15</w:t>
+        <w:t>16</w:t>
         <w:fldChar w:fldCharType="end"/>
       </w:r>
       <w:r>
@@ -12918,7 +13888,7 @@
           <w:color w:val="000000"/>
           <w:sz w:val="24"/>
         </w:rPr>
-        <w:t>5.8 Model selection and justification</w:t>
+        <w:t>5.10 Model selection and justification</w:t>
       </w:r>
     </w:p>
     <w:p>
@@ -13045,7 +14015,69 @@
           <w:color w:val="000000"/>
           <w:sz w:val="24"/>
         </w:rPr>
-        <w:t>6.1 Method and rationale</w:t>
+        <w:t>6.1 Data Preparation</w:t>
+      </w:r>
+    </w:p>
+    <w:p>
+      <w:pPr>
+        <w:spacing w:lineRule="auto" w:line="360" w:after="120"/>
+      </w:pPr>
+      <w:r>
+        <w:rPr>
+          <w:rFonts w:ascii="Times New Roman" w:hAnsi="Times New Roman" w:cs="Times New Roman" w:eastAsia="Times New Roman"/>
+          <w:b w:val="0"/>
+          <w:i w:val="0"/>
+          <w:sz w:val="22"/>
+        </w:rPr>
+        <w:t>The cleaning and preprocessing described in Section 2 is shared with the supervised task; the difference for the unsupervised task lies in what enters the model. Because k-means and the silhouette score are Euclidean measures, only the numeric attributes are used and they are standardised to zero mean and unit variance so that a variable measured in kilometres per hour cannot dominate one measured in degrees. Scattered missing values are imputed with the column median, consistent with Section 2.2. The categorical attributes are deliberately excluded from the distance metric — one-hot encoding them would distort the geometry — and are instead used afterwards to profile and interpret the clusters.</w:t>
+      </w:r>
+    </w:p>
+    <w:p>
+      <w:pPr>
+        <w:pStyle w:val="Heading2"/>
+        <w:keepNext/>
+        <w:spacing w:before="200" w:after="120" w:lineRule="auto" w:line="360"/>
+      </w:pPr>
+      <w:r>
+        <w:rPr>
+          <w:rFonts w:ascii="Times New Roman" w:hAnsi="Times New Roman" w:cs="Times New Roman" w:eastAsia="Times New Roman"/>
+          <w:b/>
+          <w:i w:val="0"/>
+          <w:color w:val="000000"/>
+          <w:sz w:val="24"/>
+        </w:rPr>
+        <w:t>6.2 Feature Development</w:t>
+      </w:r>
+    </w:p>
+    <w:p>
+      <w:pPr>
+        <w:spacing w:lineRule="auto" w:line="360" w:after="120"/>
+      </w:pPr>
+      <w:r>
+        <w:rPr>
+          <w:rFonts w:ascii="Times New Roman" w:hAnsi="Times New Roman" w:cs="Times New Roman" w:eastAsia="Times New Roman"/>
+          <w:b w:val="0"/>
+          <w:i w:val="0"/>
+          <w:sz w:val="22"/>
+        </w:rPr>
+        <w:t>Feature development for the unsupervised task is the subset question rather than the construction question. Section 4.5 measures the effect of each feature subset on clustering quality, and the result is striking: the silhouette score rises from 0.0205 when all 53 numeric features are used, to 0.0473 with the 19 highest-ranked numeric features, and to 0.1104 with only 9. A compact, well-chosen subset clusters more than five times better than the full set, because the many uninformative variables add noise to a Euclidean distance without adding structure. This is direct evidence that feature selection benefits the unsupervised model as well as the supervised one, which is exactly what the brief requires to be assessed.</w:t>
+      </w:r>
+    </w:p>
+    <w:p>
+      <w:pPr>
+        <w:pStyle w:val="Heading2"/>
+        <w:keepNext/>
+        <w:spacing w:before="200" w:after="120" w:lineRule="auto" w:line="360"/>
+      </w:pPr>
+      <w:r>
+        <w:rPr>
+          <w:rFonts w:ascii="Times New Roman" w:hAnsi="Times New Roman" w:cs="Times New Roman" w:eastAsia="Times New Roman"/>
+          <w:b/>
+          <w:i w:val="0"/>
+          <w:color w:val="000000"/>
+          <w:sz w:val="24"/>
+        </w:rPr>
+        <w:t>6.3 Model Design</w:t>
       </w:r>
     </w:p>
     <w:p>
@@ -13090,7 +14122,7 @@
           <w:color w:val="000000"/>
           <w:sz w:val="24"/>
         </w:rPr>
-        <w:t>6.2 Selecting the number of clusters</w:t>
+        <w:t>6.4 Evaluation and Validation</w:t>
       </w:r>
     </w:p>
     <w:p>
@@ -13104,7 +14136,7 @@
           <w:i w:val="0"/>
           <w:sz w:val="22"/>
         </w:rPr>
-        <w:t>k-means was fitted for k = 2 to 10. For each solution the within-cluster sum of squares (inertia) and the silhouette score were recorded. Silhouette was computed on a random sample of 10,000 records because it is an O(n²) computation. Table 16 and Figure 14 report the results.</w:t>
+        <w:t>k-means was fitted for k = 2 to 10. For each solution the within-cluster sum of squares (inertia) and the silhouette score were recorded. Silhouette was computed on a random sample of 10,000 records because it is an O(n²) computation. Table 17 and Figure 14 report the results.</w:t>
       </w:r>
     </w:p>
     <w:p>
@@ -13133,7 +14165,7 @@
         <w:fldChar w:fldCharType="begin"/>
         <w:instrText xml:space="preserve"> SEQ Table \* ARABIC </w:instrText>
         <w:fldChar w:fldCharType="separate"/>
-        <w:t>16</w:t>
+        <w:t>17</w:t>
         <w:fldChar w:fldCharType="end"/>
       </w:r>
       <w:r>
@@ -14099,6 +15131,20 @@
     </w:p>
     <w:p>
       <w:pPr>
+        <w:spacing w:lineRule="auto" w:line="360" w:after="120"/>
+      </w:pPr>
+      <w:r>
+        <w:rPr>
+          <w:rFonts w:ascii="Times New Roman" w:hAnsi="Times New Roman" w:cs="Times New Roman" w:eastAsia="Times New Roman"/>
+          <w:b w:val="0"/>
+          <w:i w:val="0"/>
+          <w:sz w:val="22"/>
+        </w:rPr>
+        <w:t>One further qualification matters, and it is an important one. The elbow and silhouette analysis above was run on the full set of 53 numeric features. Section 4.5 shows that a reduced feature subset clusters far more cleanly, so the diffuse structure reported here is partly a consequence of including many uninformative variables in the Euclidean distance rather than a fundamental property of the traffic conditions. Re-running the cluster-count selection on the reduced subset is therefore a natural next step and is listed among the recommended improvements in Section 7.5.</w:t>
+      </w:r>
+    </w:p>
+    <w:p>
+      <w:pPr>
         <w:pStyle w:val="Heading2"/>
         <w:keepNext/>
         <w:spacing w:before="200" w:after="120" w:lineRule="auto" w:line="360"/>
@@ -14111,7 +15157,7 @@
           <w:color w:val="000000"/>
           <w:sz w:val="24"/>
         </w:rPr>
-        <w:t>6.3 Final clusters and their structure</w:t>
+        <w:t>6.5 Final clusters and their structure</w:t>
       </w:r>
     </w:p>
     <w:p>
@@ -14222,7 +15268,7 @@
           <w:color w:val="000000"/>
           <w:sz w:val="24"/>
         </w:rPr>
-        <w:t>6.4 Cluster profiles and interpretation</w:t>
+        <w:t>6.6 Cluster profiles and interpretation</w:t>
       </w:r>
     </w:p>
     <w:p>
@@ -14236,7 +15282,7 @@
           <w:i w:val="0"/>
           <w:sz w:val="22"/>
         </w:rPr>
-        <w:t>The centroids are interpreted through the mean value of each feature within each cluster. Table 17 and Figure 16 give the profile, and the operational meaning of each cluster follows directly from it.</w:t>
+        <w:t>The centroids are interpreted through the mean value of each feature within each cluster. Table 18 and Figure 16 give the profile, and the operational meaning of each cluster follows directly from it.</w:t>
       </w:r>
     </w:p>
     <w:p>
@@ -14265,7 +15311,7 @@
         <w:fldChar w:fldCharType="begin"/>
         <w:instrText xml:space="preserve"> SEQ Table \* ARABIC </w:instrText>
         <w:fldChar w:fldCharType="separate"/>
-        <w:t>17</w:t>
+        <w:t>18</w:t>
         <w:fldChar w:fldCharType="end"/>
       </w:r>
       <w:r>
@@ -15533,7 +16579,7 @@
           <w:color w:val="000000"/>
           <w:sz w:val="24"/>
         </w:rPr>
-        <w:t>6.5 Validating the clusters against the withheld severity label</w:t>
+        <w:t>6.7 Validating the clusters against the withheld severity label</w:t>
       </w:r>
     </w:p>
     <w:p>
@@ -15547,7 +16593,7 @@
           <w:i w:val="0"/>
           <w:sz w:val="22"/>
         </w:rPr>
-        <w:t>Because the severity label was not used during clustering, cross-tabulating it against the discovered clusters is a genuine external validation: if the clusters have operational meaning, their severity composition should differ. Table 18 and Figure 17 show the result.</w:t>
+        <w:t>Because the severity label was not used during clustering, cross-tabulating it against the discovered clusters is a genuine external validation: if the clusters have operational meaning, their severity composition should differ. Table 19 and Figure 17 show the result.</w:t>
       </w:r>
     </w:p>
     <w:p>
@@ -15576,7 +16622,7 @@
         <w:fldChar w:fldCharType="begin"/>
         <w:instrText xml:space="preserve"> SEQ Table \* ARABIC </w:instrText>
         <w:fldChar w:fldCharType="separate"/>
-        <w:t>18</w:t>
+        <w:t>19</w:t>
         <w:fldChar w:fldCharType="end"/>
       </w:r>
       <w:r>
@@ -16232,7 +17278,7 @@
           <w:color w:val="000000"/>
           <w:sz w:val="24"/>
         </w:rPr>
-        <w:t>6.6 Detecting abnormal traffic behaviour</w:t>
+        <w:t>6.8 Detecting abnormal traffic behaviour</w:t>
       </w:r>
     </w:p>
     <w:p>
@@ -16357,7 +17403,7 @@
           <w:color w:val="000000"/>
           <w:sz w:val="24"/>
         </w:rPr>
-        <w:t>6.7 Algorithm cross-check and high-risk location analysis</w:t>
+        <w:t>6.9 Algorithm cross-check and high-risk location analysis</w:t>
       </w:r>
     </w:p>
     <w:p>
@@ -16371,329 +17417,7 @@
           <w:i w:val="0"/>
           <w:sz w:val="22"/>
         </w:rPr>
-        <w:t>To confirm that the findings are not specific to k-means, hierarchical (Ward) clustering was applied to the same standardised data and sample. Table 19 compares the two.</w:t>
-      </w:r>
-    </w:p>
-    <w:p>
-      <w:pPr>
-        <w:pStyle w:val="Caption"/>
-        <w:keepNext/>
-        <w:spacing w:lineRule="auto" w:line="240" w:after="120" w:before="40"/>
-        <w:jc w:val="left"/>
-      </w:pPr>
-      <w:r>
-        <w:rPr>
-          <w:rFonts w:ascii="Times New Roman" w:hAnsi="Times New Roman" w:cs="Times New Roman" w:eastAsia="Times New Roman"/>
-          <w:b w:val="0"/>
-          <w:i w:val="0"/>
-          <w:sz w:val="20"/>
-        </w:rPr>
-        <w:t xml:space="preserve">Table </w:t>
-      </w:r>
-      <w:r>
-        <w:rPr>
-          <w:rFonts w:ascii="Times New Roman" w:hAnsi="Times New Roman" w:cs="Times New Roman" w:eastAsia="Times New Roman"/>
-          <w:b w:val="0"/>
-          <w:i w:val="0"/>
-          <w:sz w:val="20"/>
-        </w:rPr>
-        <w:fldChar w:fldCharType="begin"/>
-        <w:instrText xml:space="preserve"> SEQ Table \* ARABIC </w:instrText>
-        <w:fldChar w:fldCharType="separate"/>
-        <w:t>19</w:t>
-        <w:fldChar w:fldCharType="end"/>
-      </w:r>
-      <w:r>
-        <w:rPr>
-          <w:rFonts w:ascii="Times New Roman" w:hAnsi="Times New Roman" w:cs="Times New Roman" w:eastAsia="Times New Roman"/>
-          <w:b w:val="0"/>
-          <w:i w:val="0"/>
-          <w:sz w:val="20"/>
-        </w:rPr>
-        <w:t>. Clustering-algorithm comparison (silhouette score on a 10,000-record sample)</w:t>
-      </w:r>
-    </w:p>
-    <w:tbl>
-      <w:tblPr>
-        <w:tblStyle w:val="TableGrid"/>
-        <w:tblW w:type="auto" w:w="0"/>
-        <w:jc w:val="center"/>
-        <w:tblLook w:firstColumn="1" w:firstRow="1" w:lastColumn="0" w:lastRow="0" w:noHBand="0" w:noVBand="1" w:val="04A0"/>
-      </w:tblPr>
-      <w:tblGrid>
-        <w:gridCol w:w="3120"/>
-        <w:gridCol w:w="3120"/>
-        <w:gridCol w:w="3120"/>
-      </w:tblGrid>
-      <w:tr>
-        <w:tc>
-          <w:tcPr>
-            <w:tcW w:type="dxa" w:w="1872"/>
-            <w:shd w:val="clear" w:color="auto" w:fill="D9E2F3"/>
-          </w:tcPr>
-          <w:p>
-            <w:pPr>
-              <w:spacing w:after="40" w:line="240" w:lineRule="auto"/>
-            </w:pPr>
-            <w:r/>
-            <w:r>
-              <w:rPr>
-                <w:rFonts w:ascii="Times New Roman" w:hAnsi="Times New Roman" w:cs="Times New Roman" w:eastAsia="Times New Roman"/>
-                <w:b/>
-                <w:i w:val="0"/>
-                <w:sz w:val="19"/>
-              </w:rPr>
-              <w:t>Algorithm</w:t>
-            </w:r>
-          </w:p>
-        </w:tc>
-        <w:tc>
-          <w:tcPr>
-            <w:tcW w:type="dxa" w:w="1872"/>
-            <w:shd w:val="clear" w:color="auto" w:fill="D9E2F3"/>
-          </w:tcPr>
-          <w:p>
-            <w:pPr>
-              <w:spacing w:after="40" w:line="240" w:lineRule="auto"/>
-            </w:pPr>
-            <w:r/>
-            <w:r>
-              <w:rPr>
-                <w:rFonts w:ascii="Times New Roman" w:hAnsi="Times New Roman" w:cs="Times New Roman" w:eastAsia="Times New Roman"/>
-                <w:b/>
-                <w:i w:val="0"/>
-                <w:sz w:val="19"/>
-              </w:rPr>
-              <w:t>Silhouette score</w:t>
-            </w:r>
-          </w:p>
-        </w:tc>
-        <w:tc>
-          <w:tcPr>
-            <w:tcW w:type="dxa" w:w="5040"/>
-            <w:shd w:val="clear" w:color="auto" w:fill="D9E2F3"/>
-          </w:tcPr>
-          <w:p>
-            <w:pPr>
-              <w:spacing w:after="40" w:line="240" w:lineRule="auto"/>
-            </w:pPr>
-            <w:r/>
-            <w:r>
-              <w:rPr>
-                <w:rFonts w:ascii="Times New Roman" w:hAnsi="Times New Roman" w:cs="Times New Roman" w:eastAsia="Times New Roman"/>
-                <w:b/>
-                <w:i w:val="0"/>
-                <w:sz w:val="19"/>
-              </w:rPr>
-              <w:t>Interpretation</w:t>
-            </w:r>
-          </w:p>
-        </w:tc>
-      </w:tr>
-      <w:tr>
-        <w:tc>
-          <w:tcPr>
-            <w:tcW w:type="dxa" w:w="1872"/>
-          </w:tcPr>
-          <w:p>
-            <w:pPr>
-              <w:spacing w:after="40" w:line="240" w:lineRule="auto"/>
-            </w:pPr>
-            <w:r/>
-            <w:r>
-              <w:rPr>
-                <w:rFonts w:ascii="Times New Roman" w:hAnsi="Times New Roman" w:cs="Times New Roman" w:eastAsia="Times New Roman"/>
-                <w:b w:val="0"/>
-                <w:i w:val="0"/>
-                <w:sz w:val="19"/>
-              </w:rPr>
-              <w:t>k-means</w:t>
-            </w:r>
-          </w:p>
-        </w:tc>
-        <w:tc>
-          <w:tcPr>
-            <w:tcW w:type="dxa" w:w="1872"/>
-          </w:tcPr>
-          <w:p>
-            <w:pPr>
-              <w:spacing w:after="40" w:line="240" w:lineRule="auto"/>
-            </w:pPr>
-            <w:r/>
-            <w:r>
-              <w:rPr>
-                <w:rFonts w:ascii="Times New Roman" w:hAnsi="Times New Roman" w:cs="Times New Roman" w:eastAsia="Times New Roman"/>
-                <w:b w:val="0"/>
-                <w:i w:val="0"/>
-                <w:sz w:val="19"/>
-              </w:rPr>
-              <w:t>0.0202</w:t>
-            </w:r>
-          </w:p>
-        </w:tc>
-        <w:tc>
-          <w:tcPr>
-            <w:tcW w:type="dxa" w:w="5040"/>
-          </w:tcPr>
-          <w:p>
-            <w:pPr>
-              <w:spacing w:after="40" w:line="240" w:lineRule="auto"/>
-            </w:pPr>
-            <w:r/>
-            <w:r>
-              <w:rPr>
-                <w:rFonts w:ascii="Times New Roman" w:hAnsi="Times New Roman" w:cs="Times New Roman" w:eastAsia="Times New Roman"/>
-                <w:b w:val="0"/>
-                <w:i w:val="0"/>
-                <w:sz w:val="19"/>
-              </w:rPr>
-              <w:t>The clusters overlap heavily — the data has no crisp natural partition.</w:t>
-            </w:r>
-          </w:p>
-        </w:tc>
-      </w:tr>
-      <w:tr>
-        <w:tc>
-          <w:tcPr>
-            <w:tcW w:type="dxa" w:w="1872"/>
-          </w:tcPr>
-          <w:p>
-            <w:pPr>
-              <w:spacing w:after="40" w:line="240" w:lineRule="auto"/>
-            </w:pPr>
-            <w:r/>
-            <w:r>
-              <w:rPr>
-                <w:rFonts w:ascii="Times New Roman" w:hAnsi="Times New Roman" w:cs="Times New Roman" w:eastAsia="Times New Roman"/>
-                <w:b w:val="0"/>
-                <w:i w:val="0"/>
-                <w:sz w:val="19"/>
-              </w:rPr>
-              <w:t>Agglomerative (Ward)</w:t>
-            </w:r>
-          </w:p>
-        </w:tc>
-        <w:tc>
-          <w:tcPr>
-            <w:tcW w:type="dxa" w:w="1872"/>
-          </w:tcPr>
-          <w:p>
-            <w:pPr>
-              <w:spacing w:after="40" w:line="240" w:lineRule="auto"/>
-            </w:pPr>
-            <w:r/>
-            <w:r>
-              <w:rPr>
-                <w:rFonts w:ascii="Times New Roman" w:hAnsi="Times New Roman" w:cs="Times New Roman" w:eastAsia="Times New Roman"/>
-                <w:b w:val="0"/>
-                <w:i w:val="0"/>
-                <w:sz w:val="19"/>
-              </w:rPr>
-              <w:t>0.0030</w:t>
-            </w:r>
-          </w:p>
-        </w:tc>
-        <w:tc>
-          <w:tcPr>
-            <w:tcW w:type="dxa" w:w="5040"/>
-          </w:tcPr>
-          <w:p>
-            <w:pPr>
-              <w:spacing w:after="40" w:line="240" w:lineRule="auto"/>
-            </w:pPr>
-            <w:r/>
-            <w:r>
-              <w:rPr>
-                <w:rFonts w:ascii="Times New Roman" w:hAnsi="Times New Roman" w:cs="Times New Roman" w:eastAsia="Times New Roman"/>
-                <w:b w:val="0"/>
-                <w:i w:val="0"/>
-                <w:sz w:val="19"/>
-              </w:rPr>
-              <w:t>The clusters overlap heavily — the data has no crisp natural partition.</w:t>
-            </w:r>
-          </w:p>
-        </w:tc>
-      </w:tr>
-      <w:tr>
-        <w:tc>
-          <w:tcPr>
-            <w:tcW w:type="dxa" w:w="1872"/>
-          </w:tcPr>
-          <w:p>
-            <w:pPr>
-              <w:spacing w:after="40" w:line="240" w:lineRule="auto"/>
-            </w:pPr>
-            <w:r/>
-            <w:r>
-              <w:rPr>
-                <w:rFonts w:ascii="Times New Roman" w:hAnsi="Times New Roman" w:cs="Times New Roman" w:eastAsia="Times New Roman"/>
-                <w:b w:val="0"/>
-                <w:i w:val="0"/>
-                <w:sz w:val="19"/>
-              </w:rPr>
-              <w:t>Comparison</w:t>
-            </w:r>
-          </w:p>
-        </w:tc>
-        <w:tc>
-          <w:tcPr>
-            <w:tcW w:type="dxa" w:w="1872"/>
-          </w:tcPr>
-          <w:p>
-            <w:pPr>
-              <w:spacing w:after="40" w:line="240" w:lineRule="auto"/>
-            </w:pPr>
-            <w:r/>
-            <w:r>
-              <w:rPr>
-                <w:rFonts w:ascii="Times New Roman" w:hAnsi="Times New Roman" w:cs="Times New Roman" w:eastAsia="Times New Roman"/>
-                <w:b w:val="0"/>
-                <w:i w:val="0"/>
-                <w:sz w:val="19"/>
-              </w:rPr>
-              <w:t>Both scores are very low</w:t>
-            </w:r>
-          </w:p>
-        </w:tc>
-        <w:tc>
-          <w:tcPr>
-            <w:tcW w:type="dxa" w:w="5040"/>
-          </w:tcPr>
-          <w:p>
-            <w:pPr>
-              <w:spacing w:after="40" w:line="240" w:lineRule="auto"/>
-            </w:pPr>
-            <w:r/>
-            <w:r>
-              <w:rPr>
-                <w:rFonts w:ascii="Times New Roman" w:hAnsi="Times New Roman" w:cs="Times New Roman" w:eastAsia="Times New Roman"/>
-                <w:b w:val="0"/>
-                <w:i w:val="0"/>
-                <w:sz w:val="19"/>
-              </w:rPr>
-              <w:t>k-means achieves the higher silhouette score at k = 4, and both algorithms agree that the traffic conditions form a continuum rather than distinct islands. The agreement between two different clustering paradigms strengthens confidence in that conclusion.</w:t>
-            </w:r>
-          </w:p>
-        </w:tc>
-      </w:tr>
-    </w:tbl>
-    <w:p>
-      <w:pPr>
-        <w:spacing w:lineRule="auto" w:line="240" w:after="80"/>
-      </w:pPr>
-    </w:p>
-    <w:p>
-      <w:pPr>
-        <w:spacing w:lineRule="auto" w:line="360" w:after="120"/>
-      </w:pPr>
-      <w:r>
-        <w:rPr>
-          <w:rFonts w:ascii="Times New Roman" w:hAnsi="Times New Roman" w:cs="Times New Roman" w:eastAsia="Times New Roman"/>
-          <w:b w:val="0"/>
-          <w:i w:val="0"/>
-          <w:sz w:val="22"/>
-        </w:rPr>
-        <w:t>Finally, the clusters and the severity labels were combined to identify high-risk locations. Table 20 lists the cities with the largest number of high-severity incidents (Severity 3 or 4), and Figure 19 plots them.</w:t>
+        <w:t>To confirm that the findings are not specific to k-means, hierarchical (Ward) clustering was applied to the same standardised data and sample. Table 20 compares the two.</w:t>
       </w:r>
     </w:p>
     <w:p>
@@ -16723,6 +17447,328 @@
         <w:instrText xml:space="preserve"> SEQ Table \* ARABIC </w:instrText>
         <w:fldChar w:fldCharType="separate"/>
         <w:t>20</w:t>
+        <w:fldChar w:fldCharType="end"/>
+      </w:r>
+      <w:r>
+        <w:rPr>
+          <w:rFonts w:ascii="Times New Roman" w:hAnsi="Times New Roman" w:cs="Times New Roman" w:eastAsia="Times New Roman"/>
+          <w:b w:val="0"/>
+          <w:i w:val="0"/>
+          <w:sz w:val="20"/>
+        </w:rPr>
+        <w:t>. Clustering-algorithm comparison (silhouette score on a 10,000-record sample)</w:t>
+      </w:r>
+    </w:p>
+    <w:tbl>
+      <w:tblPr>
+        <w:tblStyle w:val="TableGrid"/>
+        <w:tblW w:type="auto" w:w="0"/>
+        <w:jc w:val="center"/>
+        <w:tblLook w:firstColumn="1" w:firstRow="1" w:lastColumn="0" w:lastRow="0" w:noHBand="0" w:noVBand="1" w:val="04A0"/>
+      </w:tblPr>
+      <w:tblGrid>
+        <w:gridCol w:w="3120"/>
+        <w:gridCol w:w="3120"/>
+        <w:gridCol w:w="3120"/>
+      </w:tblGrid>
+      <w:tr>
+        <w:tc>
+          <w:tcPr>
+            <w:tcW w:type="dxa" w:w="1872"/>
+            <w:shd w:val="clear" w:color="auto" w:fill="D9E2F3"/>
+          </w:tcPr>
+          <w:p>
+            <w:pPr>
+              <w:spacing w:after="40" w:line="240" w:lineRule="auto"/>
+            </w:pPr>
+            <w:r/>
+            <w:r>
+              <w:rPr>
+                <w:rFonts w:ascii="Times New Roman" w:hAnsi="Times New Roman" w:cs="Times New Roman" w:eastAsia="Times New Roman"/>
+                <w:b/>
+                <w:i w:val="0"/>
+                <w:sz w:val="19"/>
+              </w:rPr>
+              <w:t>Algorithm</w:t>
+            </w:r>
+          </w:p>
+        </w:tc>
+        <w:tc>
+          <w:tcPr>
+            <w:tcW w:type="dxa" w:w="1872"/>
+            <w:shd w:val="clear" w:color="auto" w:fill="D9E2F3"/>
+          </w:tcPr>
+          <w:p>
+            <w:pPr>
+              <w:spacing w:after="40" w:line="240" w:lineRule="auto"/>
+            </w:pPr>
+            <w:r/>
+            <w:r>
+              <w:rPr>
+                <w:rFonts w:ascii="Times New Roman" w:hAnsi="Times New Roman" w:cs="Times New Roman" w:eastAsia="Times New Roman"/>
+                <w:b/>
+                <w:i w:val="0"/>
+                <w:sz w:val="19"/>
+              </w:rPr>
+              <w:t>Silhouette score</w:t>
+            </w:r>
+          </w:p>
+        </w:tc>
+        <w:tc>
+          <w:tcPr>
+            <w:tcW w:type="dxa" w:w="5040"/>
+            <w:shd w:val="clear" w:color="auto" w:fill="D9E2F3"/>
+          </w:tcPr>
+          <w:p>
+            <w:pPr>
+              <w:spacing w:after="40" w:line="240" w:lineRule="auto"/>
+            </w:pPr>
+            <w:r/>
+            <w:r>
+              <w:rPr>
+                <w:rFonts w:ascii="Times New Roman" w:hAnsi="Times New Roman" w:cs="Times New Roman" w:eastAsia="Times New Roman"/>
+                <w:b/>
+                <w:i w:val="0"/>
+                <w:sz w:val="19"/>
+              </w:rPr>
+              <w:t>Interpretation</w:t>
+            </w:r>
+          </w:p>
+        </w:tc>
+      </w:tr>
+      <w:tr>
+        <w:tc>
+          <w:tcPr>
+            <w:tcW w:type="dxa" w:w="1872"/>
+          </w:tcPr>
+          <w:p>
+            <w:pPr>
+              <w:spacing w:after="40" w:line="240" w:lineRule="auto"/>
+            </w:pPr>
+            <w:r/>
+            <w:r>
+              <w:rPr>
+                <w:rFonts w:ascii="Times New Roman" w:hAnsi="Times New Roman" w:cs="Times New Roman" w:eastAsia="Times New Roman"/>
+                <w:b w:val="0"/>
+                <w:i w:val="0"/>
+                <w:sz w:val="19"/>
+              </w:rPr>
+              <w:t>k-means</w:t>
+            </w:r>
+          </w:p>
+        </w:tc>
+        <w:tc>
+          <w:tcPr>
+            <w:tcW w:type="dxa" w:w="1872"/>
+          </w:tcPr>
+          <w:p>
+            <w:pPr>
+              <w:spacing w:after="40" w:line="240" w:lineRule="auto"/>
+            </w:pPr>
+            <w:r/>
+            <w:r>
+              <w:rPr>
+                <w:rFonts w:ascii="Times New Roman" w:hAnsi="Times New Roman" w:cs="Times New Roman" w:eastAsia="Times New Roman"/>
+                <w:b w:val="0"/>
+                <w:i w:val="0"/>
+                <w:sz w:val="19"/>
+              </w:rPr>
+              <w:t>0.0202</w:t>
+            </w:r>
+          </w:p>
+        </w:tc>
+        <w:tc>
+          <w:tcPr>
+            <w:tcW w:type="dxa" w:w="5040"/>
+          </w:tcPr>
+          <w:p>
+            <w:pPr>
+              <w:spacing w:after="40" w:line="240" w:lineRule="auto"/>
+            </w:pPr>
+            <w:r/>
+            <w:r>
+              <w:rPr>
+                <w:rFonts w:ascii="Times New Roman" w:hAnsi="Times New Roman" w:cs="Times New Roman" w:eastAsia="Times New Roman"/>
+                <w:b w:val="0"/>
+                <w:i w:val="0"/>
+                <w:sz w:val="19"/>
+              </w:rPr>
+              <w:t>The clusters overlap heavily — the data has no crisp natural partition.</w:t>
+            </w:r>
+          </w:p>
+        </w:tc>
+      </w:tr>
+      <w:tr>
+        <w:tc>
+          <w:tcPr>
+            <w:tcW w:type="dxa" w:w="1872"/>
+          </w:tcPr>
+          <w:p>
+            <w:pPr>
+              <w:spacing w:after="40" w:line="240" w:lineRule="auto"/>
+            </w:pPr>
+            <w:r/>
+            <w:r>
+              <w:rPr>
+                <w:rFonts w:ascii="Times New Roman" w:hAnsi="Times New Roman" w:cs="Times New Roman" w:eastAsia="Times New Roman"/>
+                <w:b w:val="0"/>
+                <w:i w:val="0"/>
+                <w:sz w:val="19"/>
+              </w:rPr>
+              <w:t>Agglomerative (Ward)</w:t>
+            </w:r>
+          </w:p>
+        </w:tc>
+        <w:tc>
+          <w:tcPr>
+            <w:tcW w:type="dxa" w:w="1872"/>
+          </w:tcPr>
+          <w:p>
+            <w:pPr>
+              <w:spacing w:after="40" w:line="240" w:lineRule="auto"/>
+            </w:pPr>
+            <w:r/>
+            <w:r>
+              <w:rPr>
+                <w:rFonts w:ascii="Times New Roman" w:hAnsi="Times New Roman" w:cs="Times New Roman" w:eastAsia="Times New Roman"/>
+                <w:b w:val="0"/>
+                <w:i w:val="0"/>
+                <w:sz w:val="19"/>
+              </w:rPr>
+              <w:t>0.0030</w:t>
+            </w:r>
+          </w:p>
+        </w:tc>
+        <w:tc>
+          <w:tcPr>
+            <w:tcW w:type="dxa" w:w="5040"/>
+          </w:tcPr>
+          <w:p>
+            <w:pPr>
+              <w:spacing w:after="40" w:line="240" w:lineRule="auto"/>
+            </w:pPr>
+            <w:r/>
+            <w:r>
+              <w:rPr>
+                <w:rFonts w:ascii="Times New Roman" w:hAnsi="Times New Roman" w:cs="Times New Roman" w:eastAsia="Times New Roman"/>
+                <w:b w:val="0"/>
+                <w:i w:val="0"/>
+                <w:sz w:val="19"/>
+              </w:rPr>
+              <w:t>The clusters overlap heavily — the data has no crisp natural partition.</w:t>
+            </w:r>
+          </w:p>
+        </w:tc>
+      </w:tr>
+      <w:tr>
+        <w:tc>
+          <w:tcPr>
+            <w:tcW w:type="dxa" w:w="1872"/>
+          </w:tcPr>
+          <w:p>
+            <w:pPr>
+              <w:spacing w:after="40" w:line="240" w:lineRule="auto"/>
+            </w:pPr>
+            <w:r/>
+            <w:r>
+              <w:rPr>
+                <w:rFonts w:ascii="Times New Roman" w:hAnsi="Times New Roman" w:cs="Times New Roman" w:eastAsia="Times New Roman"/>
+                <w:b w:val="0"/>
+                <w:i w:val="0"/>
+                <w:sz w:val="19"/>
+              </w:rPr>
+              <w:t>Comparison</w:t>
+            </w:r>
+          </w:p>
+        </w:tc>
+        <w:tc>
+          <w:tcPr>
+            <w:tcW w:type="dxa" w:w="1872"/>
+          </w:tcPr>
+          <w:p>
+            <w:pPr>
+              <w:spacing w:after="40" w:line="240" w:lineRule="auto"/>
+            </w:pPr>
+            <w:r/>
+            <w:r>
+              <w:rPr>
+                <w:rFonts w:ascii="Times New Roman" w:hAnsi="Times New Roman" w:cs="Times New Roman" w:eastAsia="Times New Roman"/>
+                <w:b w:val="0"/>
+                <w:i w:val="0"/>
+                <w:sz w:val="19"/>
+              </w:rPr>
+              <w:t>Both scores are very low</w:t>
+            </w:r>
+          </w:p>
+        </w:tc>
+        <w:tc>
+          <w:tcPr>
+            <w:tcW w:type="dxa" w:w="5040"/>
+          </w:tcPr>
+          <w:p>
+            <w:pPr>
+              <w:spacing w:after="40" w:line="240" w:lineRule="auto"/>
+            </w:pPr>
+            <w:r/>
+            <w:r>
+              <w:rPr>
+                <w:rFonts w:ascii="Times New Roman" w:hAnsi="Times New Roman" w:cs="Times New Roman" w:eastAsia="Times New Roman"/>
+                <w:b w:val="0"/>
+                <w:i w:val="0"/>
+                <w:sz w:val="19"/>
+              </w:rPr>
+              <w:t>k-means achieves the higher silhouette score at k = 4, and both algorithms agree that the traffic conditions form a continuum rather than distinct islands. The agreement between two different clustering paradigms strengthens confidence in that conclusion.</w:t>
+            </w:r>
+          </w:p>
+        </w:tc>
+      </w:tr>
+    </w:tbl>
+    <w:p>
+      <w:pPr>
+        <w:spacing w:lineRule="auto" w:line="240" w:after="80"/>
+      </w:pPr>
+    </w:p>
+    <w:p>
+      <w:pPr>
+        <w:spacing w:lineRule="auto" w:line="360" w:after="120"/>
+      </w:pPr>
+      <w:r>
+        <w:rPr>
+          <w:rFonts w:ascii="Times New Roman" w:hAnsi="Times New Roman" w:cs="Times New Roman" w:eastAsia="Times New Roman"/>
+          <w:b w:val="0"/>
+          <w:i w:val="0"/>
+          <w:sz w:val="22"/>
+        </w:rPr>
+        <w:t>Finally, the clusters and the severity labels were combined to identify high-risk locations. Table 21 lists the cities with the largest number of high-severity incidents (Severity 3 or 4), and Figure 19 plots them.</w:t>
+      </w:r>
+    </w:p>
+    <w:p>
+      <w:pPr>
+        <w:pStyle w:val="Caption"/>
+        <w:keepNext/>
+        <w:spacing w:lineRule="auto" w:line="240" w:after="120" w:before="40"/>
+        <w:jc w:val="left"/>
+      </w:pPr>
+      <w:r>
+        <w:rPr>
+          <w:rFonts w:ascii="Times New Roman" w:hAnsi="Times New Roman" w:cs="Times New Roman" w:eastAsia="Times New Roman"/>
+          <w:b w:val="0"/>
+          <w:i w:val="0"/>
+          <w:sz w:val="20"/>
+        </w:rPr>
+        <w:t xml:space="preserve">Table </w:t>
+      </w:r>
+      <w:r>
+        <w:rPr>
+          <w:rFonts w:ascii="Times New Roman" w:hAnsi="Times New Roman" w:cs="Times New Roman" w:eastAsia="Times New Roman"/>
+          <w:b w:val="0"/>
+          <w:i w:val="0"/>
+          <w:sz w:val="20"/>
+        </w:rPr>
+        <w:fldChar w:fldCharType="begin"/>
+        <w:instrText xml:space="preserve"> SEQ Table \* ARABIC </w:instrText>
+        <w:fldChar w:fldCharType="separate"/>
+        <w:t>21</w:t>
         <w:fldChar w:fldCharType="end"/>
       </w:r>
       <w:r>
@@ -18216,7 +19262,7 @@
           <w:i w:val="0"/>
           <w:sz w:val="22"/>
         </w:rPr>
-        <w:t>Extend the unsupervised analysis with density-based spatial clustering (DBSCAN) over latitude and longitude to detect geographic hotspots directly, and add a time-series model to forecast incident occurrence rather than only classifying it after the fact.</w:t>
+        <w:t>Re-run the cluster-count selection on the reduced feature subset identified in Section 4.5, which already clusters far more cleanly, and extend the unsupervised analysis with density-based spatial clustering (DBSCAN) over latitude and longitude to detect geographic hotspots directly.</w:t>
       </w:r>
     </w:p>
     <w:p>
@@ -18295,7 +19341,7 @@
           <w:i w:val="0"/>
           <w:sz w:val="22"/>
         </w:rPr>
-        <w:t>The feature-analysis stage proved to be the most consequential part of the work. A systematic leakage audit showed that Risk_Score is effectively a proxy for the target (correlation 0.88) and that Emergency_Response_Time is recorded only after the incident occurs. Removing both reduced the headline score from an implausible 0.98 to an honest 0.72 macro-F1, and that difference is the clearest possible demonstration of why leakage must be detected before results are believed. The ablation study further showed that a twenty-feature subset matches the full feature set, and that three independent importance methods agree on the same dominant variables.</w:t>
+        <w:t>The feature-analysis stage proved to be the most consequential part of the work. A systematic leakage audit showed that Risk_Score is effectively a proxy for the target (correlation 0.88) and that Emergency_Response_Time is recorded only after the incident occurs. Removing both reduced the headline score from an implausible 0.98 to an honest 0.70 macro-F1, and that difference is the clearest possible demonstration of why leakage must be detected before results are believed. The ablation study further showed that a twenty-feature subset matches the full feature set, and that three independent importance methods agree on the same dominant variables.</w:t>
       </w:r>
     </w:p>
     <w:p>

</xml_diff>